<commit_message>
Update Guide with domain portability and MedAffairs plugin sections
Added Section 8 (Domain-Portable Architecture) explaining the ~40% reusable
/ ~60% domain-specific split, available plugins, and how to create new ones.
Added Section 9 (CoworkPowers-MedAffairs) with full documentation of agents,
compliance standards, evidence hierarchy, MCP tools, and installation.
Updated CLAUDE.md with improved architecture documentation.

Co-Authored-By: Claude Opus 4.6 <noreply@anthropic.com>
</commit_message>
<xml_diff>
--- a/CoworkPowers-Guide.docx
+++ b/CoworkPowers-Guide.docx
@@ -8226,6 +8226,3965 @@
           <w:szCs w:val="18"/>
         </w:rPr>
         <w:t xml:space="preserve">  claude-ai-project/ (6 files)         — Claude.ai webapp version</w:t>
+      </w:r>
+    </w:p>
+    <w:p>
+      <w:r>
+        <w:br w:type="page"/>
+      </w:r>
+    </w:p>
+    <w:p>
+      <w:pPr>
+        <w:pStyle w:val="Heading1"/>
+      </w:pPr>
+      <w:r>
+        <w:t>8. Domain-Portable Architecture</w:t>
+      </w:r>
+    </w:p>
+    <w:p>
+      <w:pPr>
+        <w:spacing w:after="120" w:before="60"/>
+      </w:pPr>
+      <w:r>
+        <w:t xml:space="preserve">The CoworkPowers architecture is fundamentally domain-agnostic. The 4-phase compound loop, progressive loading, parallel agent orchestration, and learnings store are patterns that apply to any knowledge-intensive work. What changes per domain is the agent prompts, MCP tools, and quality standards.</w:t>
+      </w:r>
+    </w:p>
+    <w:p>
+      <w:pPr>
+        <w:pStyle w:val="Heading2"/>
+      </w:pPr>
+      <w:r>
+        <w:t>8.1 What Stays the Same (~40%)</w:t>
+      </w:r>
+    </w:p>
+    <w:p>
+      <w:pPr>
+        <w:pStyle w:val="ListParagraph"/>
+        <w:numPr>
+          <w:ilvl w:val="0"/>
+          <w:numId w:val="1"/>
+        </w:numPr>
+        <w:spacing w:after="60" w:before="60"/>
+      </w:pPr>
+      <w:r>
+        <w:t xml:space="preserve">The 4 skill orchestration files (with parameterized agent roster tables)</w:t>
+      </w:r>
+    </w:p>
+    <w:p>
+      <w:pPr>
+        <w:pStyle w:val="ListParagraph"/>
+        <w:numPr>
+          <w:ilvl w:val="0"/>
+          <w:numId w:val="1"/>
+        </w:numPr>
+        <w:spacing w:after="60" w:before="60"/>
+      </w:pPr>
+      <w:r>
+        <w:t xml:space="preserve">All 5 compound agents (pattern-extractor, template-creator, preference-learner, failure-analyzer, domain-insight-capturer)</w:t>
+      </w:r>
+    </w:p>
+    <w:p>
+      <w:pPr>
+        <w:pStyle w:val="ListParagraph"/>
+        <w:numPr>
+          <w:ilvl w:val="0"/>
+          <w:numId w:val="1"/>
+        </w:numPr>
+        <w:spacing w:after="60" w:before="60"/>
+      </w:pPr>
+      <w:r>
+        <w:t xml:space="preserve">Core review agents: clarity-reviewer, completeness-auditor, devils-advocate, risk-assessor</w:t>
+      </w:r>
+    </w:p>
+    <w:p>
+      <w:pPr>
+        <w:pStyle w:val="ListParagraph"/>
+        <w:numPr>
+          <w:ilvl w:val="0"/>
+          <w:numId w:val="1"/>
+        </w:numPr>
+        <w:spacing w:after="60" w:before="60"/>
+      </w:pPr>
+      <w:r>
+        <w:t xml:space="preserve">The learnings schema, INDEX.md, and YAML frontmatter contract</w:t>
+      </w:r>
+    </w:p>
+    <w:p>
+      <w:pPr>
+        <w:pStyle w:val="ListParagraph"/>
+        <w:numPr>
+          <w:ilvl w:val="0"/>
+          <w:numId w:val="1"/>
+        </w:numPr>
+        <w:spacing w:after="60" w:before="60"/>
+      </w:pPr>
+      <w:r>
+        <w:t xml:space="preserve">Plugin infrastructure (.claude-plugin, .gitignore, CONNECTORS.md)</w:t>
+      </w:r>
+    </w:p>
+    <w:p>
+      <w:pPr>
+        <w:pStyle w:val="Heading2"/>
+      </w:pPr>
+      <w:r>
+        <w:t>8.2 What Changes Per Domain (~60%)</w:t>
+      </w:r>
+    </w:p>
+    <w:p>
+      <w:pPr>
+        <w:pStyle w:val="ListParagraph"/>
+        <w:numPr>
+          <w:ilvl w:val="0"/>
+          <w:numId w:val="1"/>
+        </w:numPr>
+        <w:spacing w:after="60" w:before="60"/>
+      </w:pPr>
+      <w:r>
+        <w:t xml:space="preserve">Research agent prompts (different expertise, different search strategies)</w:t>
+      </w:r>
+    </w:p>
+    <w:p>
+      <w:pPr>
+        <w:pStyle w:val="ListParagraph"/>
+        <w:numPr>
+          <w:ilvl w:val="0"/>
+          <w:numId w:val="1"/>
+        </w:numPr>
+        <w:spacing w:after="60" w:before="60"/>
+      </w:pPr>
+      <w:r>
+        <w:t xml:space="preserve">Work agent prompts (different deliverable types and domain standards)</w:t>
+      </w:r>
+    </w:p>
+    <w:p>
+      <w:pPr>
+        <w:pStyle w:val="ListParagraph"/>
+        <w:numPr>
+          <w:ilvl w:val="0"/>
+          <w:numId w:val="1"/>
+        </w:numPr>
+        <w:spacing w:after="60" w:before="60"/>
+      </w:pPr>
+      <w:r>
+        <w:t xml:space="preserve">2-4 domain-specific review agents</w:t>
+      </w:r>
+    </w:p>
+    <w:p>
+      <w:pPr>
+        <w:pStyle w:val="ListParagraph"/>
+        <w:numPr>
+          <w:ilvl w:val="0"/>
+          <w:numId w:val="1"/>
+        </w:numPr>
+        <w:spacing w:after="60" w:before="60"/>
+      </w:pPr>
+      <w:r>
+        <w:t xml:space="preserve">Quality standards files (MBB consulting vs. ICMJE/GPP3 vs. legal citation)</w:t>
+      </w:r>
+    </w:p>
+    <w:p>
+      <w:pPr>
+        <w:pStyle w:val="ListParagraph"/>
+        <w:numPr>
+          <w:ilvl w:val="0"/>
+          <w:numId w:val="1"/>
+        </w:numPr>
+        <w:spacing w:after="60" w:before="60"/>
+      </w:pPr>
+      <w:r>
+        <w:t xml:space="preserve">MCP tool wiring and CONNECTORS.md</w:t>
+      </w:r>
+    </w:p>
+    <w:p>
+      <w:pPr>
+        <w:pStyle w:val="Heading2"/>
+      </w:pPr>
+      <w:r>
+        <w:t>8.3 Available Domain Plugins</w:t>
+      </w:r>
+    </w:p>
+    <w:tbl>
+      <w:tblPr>
+        <w:tblStyle w:val="TableGrid"/>
+        <w:tblW w:w="0" w:type="auto"/>
+      </w:tblPr>
+      <w:tblGrid>
+        <w:gridCol w:w="3116"/>
+        <w:gridCol w:w="3116"/>
+        <w:gridCol w:w="3116"/>
+      </w:tblGrid>
+      <w:tr>
+        <w:tc>
+          <w:tcPr>
+            <w:tcW w:w="0" w:type="auto"/>
+            <w:shd w:fill="1B2A4A" w:val="clear"/>
+          </w:tcPr>
+          <w:p>
+            <w:r>
+              <w:rPr>
+                <w:sz w:val="18"/>
+                <w:szCs w:val="18"/>
+                <w:color w:val="FFFFFF"/>
+                <w:b/>
+                <w:bCs/>
+              </w:rPr>
+              <w:t xml:space="preserve">Plugin</w:t>
+            </w:r>
+          </w:p>
+        </w:tc>
+        <w:tc>
+          <w:tcPr>
+            <w:tcW w:w="0" w:type="auto"/>
+            <w:shd w:fill="1B2A4A" w:val="clear"/>
+          </w:tcPr>
+          <w:p>
+            <w:r>
+              <w:rPr>
+                <w:sz w:val="18"/>
+                <w:szCs w:val="18"/>
+                <w:color w:val="FFFFFF"/>
+                <w:b/>
+                <w:bCs/>
+              </w:rPr>
+              <w:t xml:space="preserve">Domain</w:t>
+            </w:r>
+          </w:p>
+        </w:tc>
+        <w:tc>
+          <w:tcPr>
+            <w:tcW w:w="0" w:type="auto"/>
+            <w:shd w:fill="1B2A4A" w:val="clear"/>
+          </w:tcPr>
+          <w:p>
+            <w:r>
+              <w:rPr>
+                <w:sz w:val="18"/>
+                <w:szCs w:val="18"/>
+                <w:color w:val="FFFFFF"/>
+                <w:b/>
+                <w:bCs/>
+              </w:rPr>
+              <w:t xml:space="preserve">Status</w:t>
+            </w:r>
+          </w:p>
+        </w:tc>
+      </w:tr>
+      <w:tr>
+        <w:tc>
+          <w:tcPr>
+            <w:tcW w:w="0" w:type="auto"/>
+          </w:tcPr>
+          <w:p>
+            <w:r>
+              <w:rPr>
+                <w:sz w:val="18"/>
+                <w:szCs w:val="18"/>
+              </w:rPr>
+              <w:t xml:space="preserve">CoworkPowers</w:t>
+            </w:r>
+          </w:p>
+        </w:tc>
+        <w:tc>
+          <w:tcPr>
+            <w:tcW w:w="0" w:type="auto"/>
+          </w:tcPr>
+          <w:p>
+            <w:r>
+              <w:rPr>
+                <w:sz w:val="18"/>
+                <w:szCs w:val="18"/>
+              </w:rPr>
+              <w:t xml:space="preserve">Pharma/Biotech Consulting</w:t>
+            </w:r>
+          </w:p>
+        </w:tc>
+        <w:tc>
+          <w:tcPr>
+            <w:tcW w:w="0" w:type="auto"/>
+          </w:tcPr>
+          <w:p>
+            <w:r>
+              <w:rPr>
+                <w:sz w:val="18"/>
+                <w:szCs w:val="18"/>
+              </w:rPr>
+              <w:t xml:space="preserve">Released v1.0</w:t>
+            </w:r>
+          </w:p>
+        </w:tc>
+      </w:tr>
+      <w:tr>
+        <w:tc>
+          <w:tcPr>
+            <w:tcW w:w="0" w:type="auto"/>
+          </w:tcPr>
+          <w:p>
+            <w:r>
+              <w:rPr>
+                <w:sz w:val="18"/>
+                <w:szCs w:val="18"/>
+              </w:rPr>
+              <w:t xml:space="preserve">CoworkPowers-MedAffairs</w:t>
+            </w:r>
+          </w:p>
+        </w:tc>
+        <w:tc>
+          <w:tcPr>
+            <w:tcW w:w="0" w:type="auto"/>
+          </w:tcPr>
+          <w:p>
+            <w:r>
+              <w:rPr>
+                <w:sz w:val="18"/>
+                <w:szCs w:val="18"/>
+              </w:rPr>
+              <w:t xml:space="preserve">Medical Affairs &amp; HEOR</w:t>
+            </w:r>
+          </w:p>
+        </w:tc>
+        <w:tc>
+          <w:tcPr>
+            <w:tcW w:w="0" w:type="auto"/>
+          </w:tcPr>
+          <w:p>
+            <w:r>
+              <w:rPr>
+                <w:sz w:val="18"/>
+                <w:szCs w:val="18"/>
+              </w:rPr>
+              <w:t xml:space="preserve">Released v1.0</w:t>
+            </w:r>
+          </w:p>
+        </w:tc>
+      </w:tr>
+      <w:tr>
+        <w:tc>
+          <w:tcPr>
+            <w:tcW w:w="0" w:type="auto"/>
+          </w:tcPr>
+          <w:p>
+            <w:r>
+              <w:rPr>
+                <w:sz w:val="18"/>
+                <w:szCs w:val="18"/>
+              </w:rPr>
+              <w:t xml:space="preserve">CoworkPowers-TechDD</w:t>
+            </w:r>
+          </w:p>
+        </w:tc>
+        <w:tc>
+          <w:tcPr>
+            <w:tcW w:w="0" w:type="auto"/>
+          </w:tcPr>
+          <w:p>
+            <w:r>
+              <w:rPr>
+                <w:sz w:val="18"/>
+                <w:szCs w:val="18"/>
+              </w:rPr>
+              <w:t xml:space="preserve">Technology Due Diligence</w:t>
+            </w:r>
+          </w:p>
+        </w:tc>
+        <w:tc>
+          <w:tcPr>
+            <w:tcW w:w="0" w:type="auto"/>
+          </w:tcPr>
+          <w:p>
+            <w:r>
+              <w:rPr>
+                <w:sz w:val="18"/>
+                <w:szCs w:val="18"/>
+              </w:rPr>
+              <w:t xml:space="preserve">Planned</w:t>
+            </w:r>
+          </w:p>
+        </w:tc>
+      </w:tr>
+      <w:tr>
+        <w:tc>
+          <w:tcPr>
+            <w:tcW w:w="0" w:type="auto"/>
+          </w:tcPr>
+          <w:p>
+            <w:r>
+              <w:rPr>
+                <w:sz w:val="18"/>
+                <w:szCs w:val="18"/>
+              </w:rPr>
+              <w:t xml:space="preserve">CoworkPowers-Academic</w:t>
+            </w:r>
+          </w:p>
+        </w:tc>
+        <w:tc>
+          <w:tcPr>
+            <w:tcW w:w="0" w:type="auto"/>
+          </w:tcPr>
+          <w:p>
+            <w:r>
+              <w:rPr>
+                <w:sz w:val="18"/>
+                <w:szCs w:val="18"/>
+              </w:rPr>
+              <w:t xml:space="preserve">Academic Research</w:t>
+            </w:r>
+          </w:p>
+        </w:tc>
+        <w:tc>
+          <w:tcPr>
+            <w:tcW w:w="0" w:type="auto"/>
+          </w:tcPr>
+          <w:p>
+            <w:r>
+              <w:rPr>
+                <w:sz w:val="18"/>
+                <w:szCs w:val="18"/>
+              </w:rPr>
+              <w:t xml:space="preserve">Planned</w:t>
+            </w:r>
+          </w:p>
+        </w:tc>
+      </w:tr>
+    </w:tbl>
+    <w:p>
+      <w:pPr>
+        <w:spacing w:after="120" w:before="60"/>
+      </w:pPr>
+      <w:r>
+        <w:t xml:space="preserve"/>
+      </w:r>
+    </w:p>
+    <w:p>
+      <w:pPr>
+        <w:pStyle w:val="Heading2"/>
+      </w:pPr>
+      <w:r>
+        <w:t>8.4 Creating a New Domain Plugin</w:t>
+      </w:r>
+    </w:p>
+    <w:p>
+      <w:pPr>
+        <w:spacing w:after="120" w:before="60"/>
+      </w:pPr>
+      <w:r>
+        <w:t xml:space="preserve">To create a new domain plugin, fork the existing plugin structure and swap domain-specific content:</w:t>
+      </w:r>
+    </w:p>
+    <w:p>
+      <w:pPr>
+        <w:pStyle w:val="ListParagraph"/>
+        <w:numPr>
+          <w:ilvl w:val="0"/>
+          <w:numId w:val="1"/>
+        </w:numPr>
+        <w:spacing w:after="60" w:before="60"/>
+      </w:pPr>
+      <w:r>
+        <w:t xml:space="preserve">Copy the plugin directory structure</w:t>
+      </w:r>
+    </w:p>
+    <w:p>
+      <w:pPr>
+        <w:pStyle w:val="ListParagraph"/>
+        <w:numPr>
+          <w:ilvl w:val="0"/>
+          <w:numId w:val="1"/>
+        </w:numPr>
+        <w:spacing w:after="60" w:before="60"/>
+      </w:pPr>
+      <w:r>
+        <w:t xml:space="preserve">Update plugin.json with new name, description, and keywords</w:t>
+      </w:r>
+    </w:p>
+    <w:p>
+      <w:pPr>
+        <w:pStyle w:val="ListParagraph"/>
+        <w:numPr>
+          <w:ilvl w:val="0"/>
+          <w:numId w:val="1"/>
+        </w:numPr>
+        <w:spacing w:after="60" w:before="60"/>
+      </w:pPr>
+      <w:r>
+        <w:t xml:space="preserve">Rewrite research agent prompts for the new domain</w:t>
+      </w:r>
+    </w:p>
+    <w:p>
+      <w:pPr>
+        <w:pStyle w:val="ListParagraph"/>
+        <w:numPr>
+          <w:ilvl w:val="0"/>
+          <w:numId w:val="1"/>
+        </w:numPr>
+        <w:spacing w:after="60" w:before="60"/>
+      </w:pPr>
+      <w:r>
+        <w:t xml:space="preserve">Rewrite work agent prompts for the new deliverable types</w:t>
+      </w:r>
+    </w:p>
+    <w:p>
+      <w:pPr>
+        <w:pStyle w:val="ListParagraph"/>
+        <w:numPr>
+          <w:ilvl w:val="0"/>
+          <w:numId w:val="1"/>
+        </w:numPr>
+        <w:spacing w:after="60" w:before="60"/>
+      </w:pPr>
+      <w:r>
+        <w:t xml:space="preserve">Add domain-specific review agents (keep core reviewers)</w:t>
+      </w:r>
+    </w:p>
+    <w:p>
+      <w:pPr>
+        <w:pStyle w:val="ListParagraph"/>
+        <w:numPr>
+          <w:ilvl w:val="0"/>
+          <w:numId w:val="1"/>
+        </w:numPr>
+        <w:spacing w:after="60" w:before="60"/>
+      </w:pPr>
+      <w:r>
+        <w:t xml:space="preserve">Create new standards file with domain quality requirements</w:t>
+      </w:r>
+    </w:p>
+    <w:p>
+      <w:pPr>
+        <w:pStyle w:val="ListParagraph"/>
+        <w:numPr>
+          <w:ilvl w:val="0"/>
+          <w:numId w:val="1"/>
+        </w:numPr>
+        <w:spacing w:after="60" w:before="60"/>
+      </w:pPr>
+      <w:r>
+        <w:t xml:space="preserve">Update CONNECTORS.md with relevant MCP tools</w:t>
+      </w:r>
+    </w:p>
+    <w:p>
+      <w:pPr>
+        <w:pStyle w:val="ListParagraph"/>
+        <w:numPr>
+          <w:ilvl w:val="0"/>
+          <w:numId w:val="1"/>
+        </w:numPr>
+        <w:spacing w:after="60" w:before="60"/>
+      </w:pPr>
+      <w:r>
+        <w:t xml:space="preserve">Update skill SKILL.md files with new agent roster tables and work type classifications</w:t>
+      </w:r>
+    </w:p>
+    <w:p>
+      <w:r>
+        <w:br w:type="page"/>
+      </w:r>
+    </w:p>
+    <w:p>
+      <w:pPr>
+        <w:pStyle w:val="Heading1"/>
+      </w:pPr>
+      <w:r>
+        <w:t>9. CoworkPowers-MedAffairs: Medical Affairs &amp; HEOR</w:t>
+      </w:r>
+    </w:p>
+    <w:p>
+      <w:pPr>
+        <w:spacing w:after="120" w:before="60"/>
+      </w:pPr>
+      <w:r>
+        <w:rPr>
+          <w:b/>
+          <w:bCs/>
+        </w:rPr>
+        <w:t xml:space="preserve">CoworkPowers-MedAffairs</w:t>
+      </w:r>
+      <w:r>
+        <w:t xml:space="preserve"> is a domain-specific plugin for Medical Affairs and Health Economics &amp; Outcomes Research (HEOR). It uses the same 4-phase compound loop but with agents, standards, and MCP tools optimized for evidence dissemination, publication planning, value communication, and payer strategy.</w:t>
+      </w:r>
+    </w:p>
+    <w:p>
+      <w:pPr>
+        <w:pStyle w:val="Heading2"/>
+      </w:pPr>
+      <w:r>
+        <w:t>9.1 Domain Focus</w:t>
+      </w:r>
+    </w:p>
+    <w:p>
+      <w:pPr>
+        <w:pStyle w:val="ListParagraph"/>
+        <w:numPr>
+          <w:ilvl w:val="0"/>
+          <w:numId w:val="1"/>
+        </w:numPr>
+        <w:spacing w:after="60" w:before="60"/>
+      </w:pPr>
+      <w:r>
+        <w:rPr>
+          <w:b/>
+          <w:bCs/>
+        </w:rPr>
+        <w:t xml:space="preserve">Publication Planning: </w:t>
+      </w:r>
+      <w:r>
+        <w:t xml:space="preserve">Publication planning, manuscript development, journal selection, author engagement</w:t>
+      </w:r>
+    </w:p>
+    <w:p>
+      <w:pPr>
+        <w:pStyle w:val="ListParagraph"/>
+        <w:numPr>
+          <w:ilvl w:val="0"/>
+          <w:numId w:val="1"/>
+        </w:numPr>
+        <w:spacing w:after="60" w:before="60"/>
+      </w:pPr>
+      <w:r>
+        <w:rPr>
+          <w:b/>
+          <w:bCs/>
+        </w:rPr>
+        <w:t xml:space="preserve">Evidence Synthesis: </w:t>
+      </w:r>
+      <w:r>
+        <w:t xml:space="preserve">Systematic reviews, targeted literature reviews, evidence gap analyses</w:t>
+      </w:r>
+    </w:p>
+    <w:p>
+      <w:pPr>
+        <w:pStyle w:val="ListParagraph"/>
+        <w:numPr>
+          <w:ilvl w:val="0"/>
+          <w:numId w:val="1"/>
+        </w:numPr>
+        <w:spacing w:after="60" w:before="60"/>
+      </w:pPr>
+      <w:r>
+        <w:rPr>
+          <w:b/>
+          <w:bCs/>
+        </w:rPr>
+        <w:t xml:space="preserve">Value Communication: </w:t>
+      </w:r>
+      <w:r>
+        <w:t xml:space="preserve">AMCP dossiers, global value dossiers, value stories, payer toolkits</w:t>
+      </w:r>
+    </w:p>
+    <w:p>
+      <w:pPr>
+        <w:pStyle w:val="ListParagraph"/>
+        <w:numPr>
+          <w:ilvl w:val="0"/>
+          <w:numId w:val="1"/>
+        </w:numPr>
+        <w:spacing w:after="60" w:before="60"/>
+      </w:pPr>
+      <w:r>
+        <w:rPr>
+          <w:b/>
+          <w:bCs/>
+        </w:rPr>
+        <w:t xml:space="preserve">Payer Strategy: </w:t>
+      </w:r>
+      <w:r>
+        <w:t xml:space="preserve">HTA submissions, cost-effectiveness analyses, budget impact models</w:t>
+      </w:r>
+    </w:p>
+    <w:p>
+      <w:pPr>
+        <w:pStyle w:val="ListParagraph"/>
+        <w:numPr>
+          <w:ilvl w:val="0"/>
+          <w:numId w:val="1"/>
+        </w:numPr>
+        <w:spacing w:after="60" w:before="60"/>
+      </w:pPr>
+      <w:r>
+        <w:rPr>
+          <w:b/>
+          <w:bCs/>
+        </w:rPr>
+        <w:t xml:space="preserve">Medical Education: </w:t>
+      </w:r>
+      <w:r>
+        <w:t xml:space="preserve">Advisory boards, CME programs, MSL training materials</w:t>
+      </w:r>
+    </w:p>
+    <w:p>
+      <w:pPr>
+        <w:pStyle w:val="ListParagraph"/>
+        <w:numPr>
+          <w:ilvl w:val="0"/>
+          <w:numId w:val="1"/>
+        </w:numPr>
+        <w:spacing w:after="60" w:before="60"/>
+      </w:pPr>
+      <w:r>
+        <w:rPr>
+          <w:b/>
+          <w:bCs/>
+        </w:rPr>
+        <w:t xml:space="preserve">Congress Strategy: </w:t>
+      </w:r>
+      <w:r>
+        <w:t xml:space="preserve">Abstract development, poster/presentation planning, congress engagement</w:t>
+      </w:r>
+    </w:p>
+    <w:p>
+      <w:pPr>
+        <w:pStyle w:val="ListParagraph"/>
+        <w:numPr>
+          <w:ilvl w:val="0"/>
+          <w:numId w:val="1"/>
+        </w:numPr>
+        <w:spacing w:after="60" w:before="60"/>
+      </w:pPr>
+      <w:r>
+        <w:rPr>
+          <w:b/>
+          <w:bCs/>
+        </w:rPr>
+        <w:t xml:space="preserve">KOL Engagement: </w:t>
+      </w:r>
+      <w:r>
+        <w:t xml:space="preserve">KOL identification and profiling, advisory board design</w:t>
+      </w:r>
+    </w:p>
+    <w:p>
+      <w:pPr>
+        <w:pStyle w:val="ListParagraph"/>
+        <w:numPr>
+          <w:ilvl w:val="0"/>
+          <w:numId w:val="1"/>
+        </w:numPr>
+        <w:spacing w:after="60" w:before="60"/>
+      </w:pPr>
+      <w:r>
+        <w:rPr>
+          <w:b/>
+          <w:bCs/>
+        </w:rPr>
+        <w:t xml:space="preserve">HEOR Analysis: </w:t>
+      </w:r>
+      <w:r>
+        <w:t xml:space="preserve">Economic modeling, outcomes research, PRO strategy, RWE study design</w:t>
+      </w:r>
+    </w:p>
+    <w:p>
+      <w:pPr>
+        <w:pStyle w:val="Heading2"/>
+      </w:pPr>
+      <w:r>
+        <w:t>9.2 The Compound Loop</w:t>
+      </w:r>
+    </w:p>
+    <w:tbl>
+      <w:tblPr>
+        <w:tblStyle w:val="TableGrid"/>
+        <w:tblW w:w="0" w:type="auto"/>
+      </w:tblPr>
+      <w:tblGrid>
+        <w:gridCol w:w="3116"/>
+        <w:gridCol w:w="3116"/>
+        <w:gridCol w:w="3116"/>
+      </w:tblGrid>
+      <w:tr>
+        <w:tc>
+          <w:tcPr>
+            <w:tcW w:w="0" w:type="auto"/>
+            <w:shd w:fill="1B2A4A" w:val="clear"/>
+          </w:tcPr>
+          <w:p>
+            <w:r>
+              <w:rPr>
+                <w:sz w:val="18"/>
+                <w:szCs w:val="18"/>
+                <w:color w:val="FFFFFF"/>
+                <w:b/>
+                <w:bCs/>
+              </w:rPr>
+              <w:t xml:space="preserve">Phase</w:t>
+            </w:r>
+          </w:p>
+        </w:tc>
+        <w:tc>
+          <w:tcPr>
+            <w:tcW w:w="0" w:type="auto"/>
+            <w:shd w:fill="1B2A4A" w:val="clear"/>
+          </w:tcPr>
+          <w:p>
+            <w:r>
+              <w:rPr>
+                <w:sz w:val="18"/>
+                <w:szCs w:val="18"/>
+                <w:color w:val="FFFFFF"/>
+                <w:b/>
+                <w:bCs/>
+              </w:rPr>
+              <w:t xml:space="preserve">Skill Command</w:t>
+            </w:r>
+          </w:p>
+        </w:tc>
+        <w:tc>
+          <w:tcPr>
+            <w:tcW w:w="0" w:type="auto"/>
+            <w:shd w:fill="1B2A4A" w:val="clear"/>
+          </w:tcPr>
+          <w:p>
+            <w:r>
+              <w:rPr>
+                <w:sz w:val="18"/>
+                <w:szCs w:val="18"/>
+                <w:color w:val="FFFFFF"/>
+                <w:b/>
+                <w:bCs/>
+              </w:rPr>
+              <w:t xml:space="preserve">What It Does</w:t>
+            </w:r>
+          </w:p>
+        </w:tc>
+      </w:tr>
+      <w:tr>
+        <w:tc>
+          <w:tcPr>
+            <w:tcW w:w="0" w:type="auto"/>
+          </w:tcPr>
+          <w:p>
+            <w:r>
+              <w:rPr>
+                <w:sz w:val="18"/>
+                <w:szCs w:val="18"/>
+              </w:rPr>
+              <w:t xml:space="preserve">1. Research</w:t>
+            </w:r>
+          </w:p>
+        </w:tc>
+        <w:tc>
+          <w:tcPr>
+            <w:tcW w:w="0" w:type="auto"/>
+          </w:tcPr>
+          <w:p>
+            <w:r>
+              <w:rPr>
+                <w:sz w:val="18"/>
+                <w:szCs w:val="18"/>
+              </w:rPr>
+              <w:t xml:space="preserve">/coworkpowers-medaffairs:workflow-research</w:t>
+            </w:r>
+          </w:p>
+        </w:tc>
+        <w:tc>
+          <w:tcPr>
+            <w:tcW w:w="0" w:type="auto"/>
+          </w:tcPr>
+          <w:p>
+            <w:r>
+              <w:rPr>
+                <w:sz w:val="18"/>
+                <w:szCs w:val="18"/>
+              </w:rPr>
+              <w:t xml:space="preserve">Classify task, gather evidence, synthesize into plan</w:t>
+            </w:r>
+          </w:p>
+        </w:tc>
+      </w:tr>
+      <w:tr>
+        <w:tc>
+          <w:tcPr>
+            <w:tcW w:w="0" w:type="auto"/>
+          </w:tcPr>
+          <w:p>
+            <w:r>
+              <w:rPr>
+                <w:sz w:val="18"/>
+                <w:szCs w:val="18"/>
+              </w:rPr>
+              <w:t xml:space="preserve">2. Work</w:t>
+            </w:r>
+          </w:p>
+        </w:tc>
+        <w:tc>
+          <w:tcPr>
+            <w:tcW w:w="0" w:type="auto"/>
+          </w:tcPr>
+          <w:p>
+            <w:r>
+              <w:rPr>
+                <w:sz w:val="18"/>
+                <w:szCs w:val="18"/>
+              </w:rPr>
+              <w:t xml:space="preserve">/coworkpowers-medaffairs:workflow-work</w:t>
+            </w:r>
+          </w:p>
+        </w:tc>
+        <w:tc>
+          <w:tcPr>
+            <w:tcW w:w="0" w:type="auto"/>
+          </w:tcPr>
+          <w:p>
+            <w:r>
+              <w:rPr>
+                <w:sz w:val="18"/>
+                <w:szCs w:val="18"/>
+              </w:rPr>
+              <w:t xml:space="preserve">Execute plan with specialized Medical Affairs agents</w:t>
+            </w:r>
+          </w:p>
+        </w:tc>
+      </w:tr>
+      <w:tr>
+        <w:tc>
+          <w:tcPr>
+            <w:tcW w:w="0" w:type="auto"/>
+          </w:tcPr>
+          <w:p>
+            <w:r>
+              <w:rPr>
+                <w:sz w:val="18"/>
+                <w:szCs w:val="18"/>
+              </w:rPr>
+              <w:t xml:space="preserve">3. Review</w:t>
+            </w:r>
+          </w:p>
+        </w:tc>
+        <w:tc>
+          <w:tcPr>
+            <w:tcW w:w="0" w:type="auto"/>
+          </w:tcPr>
+          <w:p>
+            <w:r>
+              <w:rPr>
+                <w:sz w:val="18"/>
+                <w:szCs w:val="18"/>
+              </w:rPr>
+              <w:t xml:space="preserve">/coworkpowers-medaffairs:workflow-review</w:t>
+            </w:r>
+          </w:p>
+        </w:tc>
+        <w:tc>
+          <w:tcPr>
+            <w:tcW w:w="0" w:type="auto"/>
+          </w:tcPr>
+          <w:p>
+            <w:r>
+              <w:rPr>
+                <w:sz w:val="18"/>
+                <w:szCs w:val="18"/>
+              </w:rPr>
+              <w:t xml:space="preserve">Multi-perspective quality review with compliance checks</w:t>
+            </w:r>
+          </w:p>
+        </w:tc>
+      </w:tr>
+      <w:tr>
+        <w:tc>
+          <w:tcPr>
+            <w:tcW w:w="0" w:type="auto"/>
+          </w:tcPr>
+          <w:p>
+            <w:r>
+              <w:rPr>
+                <w:sz w:val="18"/>
+                <w:szCs w:val="18"/>
+              </w:rPr>
+              <w:t xml:space="preserve">4. Compound</w:t>
+            </w:r>
+          </w:p>
+        </w:tc>
+        <w:tc>
+          <w:tcPr>
+            <w:tcW w:w="0" w:type="auto"/>
+          </w:tcPr>
+          <w:p>
+            <w:r>
+              <w:rPr>
+                <w:sz w:val="18"/>
+                <w:szCs w:val="18"/>
+              </w:rPr>
+              <w:t xml:space="preserve">/coworkpowers-medaffairs:workflow-compound</w:t>
+            </w:r>
+          </w:p>
+        </w:tc>
+        <w:tc>
+          <w:tcPr>
+            <w:tcW w:w="0" w:type="auto"/>
+          </w:tcPr>
+          <w:p>
+            <w:r>
+              <w:rPr>
+                <w:sz w:val="18"/>
+                <w:szCs w:val="18"/>
+              </w:rPr>
+              <w:t xml:space="preserve">Extract patterns, templates, preferences, insights</w:t>
+            </w:r>
+          </w:p>
+        </w:tc>
+      </w:tr>
+    </w:tbl>
+    <w:p>
+      <w:pPr>
+        <w:spacing w:after="120" w:before="60"/>
+      </w:pPr>
+      <w:r>
+        <w:t xml:space="preserve"/>
+      </w:r>
+    </w:p>
+    <w:p>
+      <w:pPr>
+        <w:pStyle w:val="Heading2"/>
+      </w:pPr>
+      <w:r>
+        <w:t>9.3 Research Agents (9)</w:t>
+      </w:r>
+    </w:p>
+    <w:tbl>
+      <w:tblPr>
+        <w:tblStyle w:val="TableGrid"/>
+        <w:tblW w:w="0" w:type="auto"/>
+      </w:tblPr>
+      <w:tblGrid>
+        <w:gridCol w:w="3116"/>
+        <w:gridCol w:w="3116"/>
+        <w:gridCol w:w="3116"/>
+      </w:tblGrid>
+      <w:tr>
+        <w:tc>
+          <w:tcPr>
+            <w:tcW w:w="0" w:type="auto"/>
+            <w:shd w:fill="1B2A4A" w:val="clear"/>
+          </w:tcPr>
+          <w:p>
+            <w:r>
+              <w:rPr>
+                <w:sz w:val="18"/>
+                <w:szCs w:val="18"/>
+                <w:color w:val="FFFFFF"/>
+                <w:b/>
+                <w:bCs/>
+              </w:rPr>
+              <w:t xml:space="preserve">Agent</w:t>
+            </w:r>
+          </w:p>
+        </w:tc>
+        <w:tc>
+          <w:tcPr>
+            <w:tcW w:w="0" w:type="auto"/>
+            <w:shd w:fill="1B2A4A" w:val="clear"/>
+          </w:tcPr>
+          <w:p>
+            <w:r>
+              <w:rPr>
+                <w:sz w:val="18"/>
+                <w:szCs w:val="18"/>
+                <w:color w:val="FFFFFF"/>
+                <w:b/>
+                <w:bCs/>
+              </w:rPr>
+              <w:t xml:space="preserve">Role</w:t>
+            </w:r>
+          </w:p>
+        </w:tc>
+        <w:tc>
+          <w:tcPr>
+            <w:tcW w:w="0" w:type="auto"/>
+            <w:shd w:fill="1B2A4A" w:val="clear"/>
+          </w:tcPr>
+          <w:p>
+            <w:r>
+              <w:rPr>
+                <w:sz w:val="18"/>
+                <w:szCs w:val="18"/>
+                <w:color w:val="FFFFFF"/>
+                <w:b/>
+                <w:bCs/>
+              </w:rPr>
+              <w:t xml:space="preserve">Key MCP Tools</w:t>
+            </w:r>
+          </w:p>
+        </w:tc>
+      </w:tr>
+      <w:tr>
+        <w:tc>
+          <w:tcPr>
+            <w:tcW w:w="0" w:type="auto"/>
+          </w:tcPr>
+          <w:p>
+            <w:r>
+              <w:rPr>
+                <w:sz w:val="18"/>
+                <w:szCs w:val="18"/>
+              </w:rPr>
+              <w:t xml:space="preserve">evidence-synthesizer</w:t>
+            </w:r>
+          </w:p>
+        </w:tc>
+        <w:tc>
+          <w:tcPr>
+            <w:tcW w:w="0" w:type="auto"/>
+          </w:tcPr>
+          <w:p>
+            <w:r>
+              <w:rPr>
+                <w:sz w:val="18"/>
+                <w:szCs w:val="18"/>
+              </w:rPr>
+              <w:t xml:space="preserve">Search, grade, and synthesize clinical evidence</w:t>
+            </w:r>
+          </w:p>
+        </w:tc>
+        <w:tc>
+          <w:tcPr>
+            <w:tcW w:w="0" w:type="auto"/>
+          </w:tcPr>
+          <w:p>
+            <w:r>
+              <w:rPr>
+                <w:sz w:val="18"/>
+                <w:szCs w:val="18"/>
+              </w:rPr>
+              <w:t xml:space="preserve">PubMed, bioRxiv, ClinicalTrials.gov</w:t>
+            </w:r>
+          </w:p>
+        </w:tc>
+      </w:tr>
+      <w:tr>
+        <w:tc>
+          <w:tcPr>
+            <w:tcW w:w="0" w:type="auto"/>
+          </w:tcPr>
+          <w:p>
+            <w:r>
+              <w:rPr>
+                <w:sz w:val="18"/>
+                <w:szCs w:val="18"/>
+              </w:rPr>
+              <w:t xml:space="preserve">publication-landscape-scout</w:t>
+            </w:r>
+          </w:p>
+        </w:tc>
+        <w:tc>
+          <w:tcPr>
+            <w:tcW w:w="0" w:type="auto"/>
+          </w:tcPr>
+          <w:p>
+            <w:r>
+              <w:rPr>
+                <w:sz w:val="18"/>
+                <w:szCs w:val="18"/>
+              </w:rPr>
+              <w:t xml:space="preserve">Map publications, gaps, key authors, journal strategies</w:t>
+            </w:r>
+          </w:p>
+        </w:tc>
+        <w:tc>
+          <w:tcPr>
+            <w:tcW w:w="0" w:type="auto"/>
+          </w:tcPr>
+          <w:p>
+            <w:r>
+              <w:rPr>
+                <w:sz w:val="18"/>
+                <w:szCs w:val="18"/>
+              </w:rPr>
+              <w:t xml:space="preserve">PubMed, bioRxiv</w:t>
+            </w:r>
+          </w:p>
+        </w:tc>
+      </w:tr>
+      <w:tr>
+        <w:tc>
+          <w:tcPr>
+            <w:tcW w:w="0" w:type="auto"/>
+          </w:tcPr>
+          <w:p>
+            <w:r>
+              <w:rPr>
+                <w:sz w:val="18"/>
+                <w:szCs w:val="18"/>
+              </w:rPr>
+              <w:t xml:space="preserve">competitor-evidence-tracker</w:t>
+            </w:r>
+          </w:p>
+        </w:tc>
+        <w:tc>
+          <w:tcPr>
+            <w:tcW w:w="0" w:type="auto"/>
+          </w:tcPr>
+          <w:p>
+            <w:r>
+              <w:rPr>
+                <w:sz w:val="18"/>
+                <w:szCs w:val="18"/>
+              </w:rPr>
+              <w:t xml:space="preserve">Track competitor evidence and differentiation opportunities</w:t>
+            </w:r>
+          </w:p>
+        </w:tc>
+        <w:tc>
+          <w:tcPr>
+            <w:tcW w:w="0" w:type="auto"/>
+          </w:tcPr>
+          <w:p>
+            <w:r>
+              <w:rPr>
+                <w:sz w:val="18"/>
+                <w:szCs w:val="18"/>
+              </w:rPr>
+              <w:t xml:space="preserve">ClinicalTrials.gov, ChEMBL, PubMed</w:t>
+            </w:r>
+          </w:p>
+        </w:tc>
+      </w:tr>
+      <w:tr>
+        <w:tc>
+          <w:tcPr>
+            <w:tcW w:w="0" w:type="auto"/>
+          </w:tcPr>
+          <w:p>
+            <w:r>
+              <w:rPr>
+                <w:sz w:val="18"/>
+                <w:szCs w:val="18"/>
+              </w:rPr>
+              <w:t xml:space="preserve">KOL-mapper</w:t>
+            </w:r>
+          </w:p>
+        </w:tc>
+        <w:tc>
+          <w:tcPr>
+            <w:tcW w:w="0" w:type="auto"/>
+          </w:tcPr>
+          <w:p>
+            <w:r>
+              <w:rPr>
+                <w:sz w:val="18"/>
+                <w:szCs w:val="18"/>
+              </w:rPr>
+              <w:t xml:space="preserve">Identify and profile Key Opinion Leaders</w:t>
+            </w:r>
+          </w:p>
+        </w:tc>
+        <w:tc>
+          <w:tcPr>
+            <w:tcW w:w="0" w:type="auto"/>
+          </w:tcPr>
+          <w:p>
+            <w:r>
+              <w:rPr>
+                <w:sz w:val="18"/>
+                <w:szCs w:val="18"/>
+              </w:rPr>
+              <w:t xml:space="preserve">PubMed, ClinicalTrials.gov</w:t>
+            </w:r>
+          </w:p>
+        </w:tc>
+      </w:tr>
+      <w:tr>
+        <w:tc>
+          <w:tcPr>
+            <w:tcW w:w="0" w:type="auto"/>
+          </w:tcPr>
+          <w:p>
+            <w:r>
+              <w:rPr>
+                <w:sz w:val="18"/>
+                <w:szCs w:val="18"/>
+              </w:rPr>
+              <w:t xml:space="preserve">payer-landscape-analyst</w:t>
+            </w:r>
+          </w:p>
+        </w:tc>
+        <w:tc>
+          <w:tcPr>
+            <w:tcW w:w="0" w:type="auto"/>
+          </w:tcPr>
+          <w:p>
+            <w:r>
+              <w:rPr>
+                <w:sz w:val="18"/>
+                <w:szCs w:val="18"/>
+              </w:rPr>
+              <w:t xml:space="preserve">Map HTA requirements, pricing, evidence gaps</w:t>
+            </w:r>
+          </w:p>
+        </w:tc>
+        <w:tc>
+          <w:tcPr>
+            <w:tcW w:w="0" w:type="auto"/>
+          </w:tcPr>
+          <w:p>
+            <w:r>
+              <w:rPr>
+                <w:sz w:val="18"/>
+                <w:szCs w:val="18"/>
+              </w:rPr>
+              <w:t xml:space="preserve">PubMed, ChEMBL, Web search</w:t>
+            </w:r>
+          </w:p>
+        </w:tc>
+      </w:tr>
+      <w:tr>
+        <w:tc>
+          <w:tcPr>
+            <w:tcW w:w="0" w:type="auto"/>
+          </w:tcPr>
+          <w:p>
+            <w:r>
+              <w:rPr>
+                <w:sz w:val="18"/>
+                <w:szCs w:val="18"/>
+              </w:rPr>
+              <w:t xml:space="preserve">guideline-scanner</w:t>
+            </w:r>
+          </w:p>
+        </w:tc>
+        <w:tc>
+          <w:tcPr>
+            <w:tcW w:w="0" w:type="auto"/>
+          </w:tcPr>
+          <w:p>
+            <w:r>
+              <w:rPr>
+                <w:sz w:val="18"/>
+                <w:szCs w:val="18"/>
+              </w:rPr>
+              <w:t xml:space="preserve">Identify treatment guidelines and reporting standards</w:t>
+            </w:r>
+          </w:p>
+        </w:tc>
+        <w:tc>
+          <w:tcPr>
+            <w:tcW w:w="0" w:type="auto"/>
+          </w:tcPr>
+          <w:p>
+            <w:r>
+              <w:rPr>
+                <w:sz w:val="18"/>
+                <w:szCs w:val="18"/>
+              </w:rPr>
+              <w:t xml:space="preserve">PubMed, Web search</w:t>
+            </w:r>
+          </w:p>
+        </w:tc>
+      </w:tr>
+      <w:tr>
+        <w:tc>
+          <w:tcPr>
+            <w:tcW w:w="0" w:type="auto"/>
+          </w:tcPr>
+          <w:p>
+            <w:r>
+              <w:rPr>
+                <w:sz w:val="18"/>
+                <w:szCs w:val="18"/>
+              </w:rPr>
+              <w:t xml:space="preserve">constraint-analyzer</w:t>
+            </w:r>
+          </w:p>
+        </w:tc>
+        <w:tc>
+          <w:tcPr>
+            <w:tcW w:w="0" w:type="auto"/>
+          </w:tcPr>
+          <w:p>
+            <w:r>
+              <w:rPr>
+                <w:sz w:val="18"/>
+                <w:szCs w:val="18"/>
+              </w:rPr>
+              <w:t xml:space="preserve">Assess data availability, timelines, compliance, budget</w:t>
+            </w:r>
+          </w:p>
+        </w:tc>
+        <w:tc>
+          <w:tcPr>
+            <w:tcW w:w="0" w:type="auto"/>
+          </w:tcPr>
+          <w:p>
+            <w:r>
+              <w:rPr>
+                <w:sz w:val="18"/>
+                <w:szCs w:val="18"/>
+              </w:rPr>
+              <w:t xml:space="preserve">Web search</w:t>
+            </w:r>
+          </w:p>
+        </w:tc>
+      </w:tr>
+      <w:tr>
+        <w:tc>
+          <w:tcPr>
+            <w:tcW w:w="0" w:type="auto"/>
+          </w:tcPr>
+          <w:p>
+            <w:r>
+              <w:rPr>
+                <w:sz w:val="18"/>
+                <w:szCs w:val="18"/>
+              </w:rPr>
+              <w:t xml:space="preserve">precedent-researcher</w:t>
+            </w:r>
+          </w:p>
+        </w:tc>
+        <w:tc>
+          <w:tcPr>
+            <w:tcW w:w="0" w:type="auto"/>
+          </w:tcPr>
+          <w:p>
+            <w:r>
+              <w:rPr>
+                <w:sz w:val="18"/>
+                <w:szCs w:val="18"/>
+              </w:rPr>
+              <w:t xml:space="preserve">Past learnings + industry best practices (ISMPP, ISPOR)</w:t>
+            </w:r>
+          </w:p>
+        </w:tc>
+        <w:tc>
+          <w:tcPr>
+            <w:tcW w:w="0" w:type="auto"/>
+          </w:tcPr>
+          <w:p>
+            <w:r>
+              <w:rPr>
+                <w:sz w:val="18"/>
+                <w:szCs w:val="18"/>
+              </w:rPr>
+              <w:t xml:space="preserve">File system, web search</w:t>
+            </w:r>
+          </w:p>
+        </w:tc>
+      </w:tr>
+      <w:tr>
+        <w:tc>
+          <w:tcPr>
+            <w:tcW w:w="0" w:type="auto"/>
+          </w:tcPr>
+          <w:p>
+            <w:r>
+              <w:rPr>
+                <w:sz w:val="18"/>
+                <w:szCs w:val="18"/>
+              </w:rPr>
+              <w:t xml:space="preserve">plan-synthesizer</w:t>
+            </w:r>
+          </w:p>
+        </w:tc>
+        <w:tc>
+          <w:tcPr>
+            <w:tcW w:w="0" w:type="auto"/>
+          </w:tcPr>
+          <w:p>
+            <w:r>
+              <w:rPr>
+                <w:sz w:val="18"/>
+                <w:szCs w:val="18"/>
+              </w:rPr>
+              <w:t xml:space="preserve">Merge all agent outputs into execution plan</w:t>
+            </w:r>
+          </w:p>
+        </w:tc>
+        <w:tc>
+          <w:tcPr>
+            <w:tcW w:w="0" w:type="auto"/>
+          </w:tcPr>
+          <w:p>
+            <w:r>
+              <w:rPr>
+                <w:sz w:val="18"/>
+                <w:szCs w:val="18"/>
+              </w:rPr>
+              <w:t xml:space="preserve">None (synthesis only)</w:t>
+            </w:r>
+          </w:p>
+        </w:tc>
+      </w:tr>
+    </w:tbl>
+    <w:p>
+      <w:pPr>
+        <w:spacing w:after="120" w:before="60"/>
+      </w:pPr>
+      <w:r>
+        <w:t xml:space="preserve"/>
+      </w:r>
+    </w:p>
+    <w:p>
+      <w:pPr>
+        <w:pStyle w:val="Heading2"/>
+      </w:pPr>
+      <w:r>
+        <w:t>9.4 Work Agents (8)</w:t>
+      </w:r>
+    </w:p>
+    <w:tbl>
+      <w:tblPr>
+        <w:tblStyle w:val="TableGrid"/>
+        <w:tblW w:w="0" w:type="auto"/>
+      </w:tblPr>
+      <w:tblGrid>
+        <w:gridCol w:w="3116"/>
+        <w:gridCol w:w="3116"/>
+        <w:gridCol w:w="3116"/>
+      </w:tblGrid>
+      <w:tr>
+        <w:tc>
+          <w:tcPr>
+            <w:tcW w:w="0" w:type="auto"/>
+            <w:shd w:fill="1B2A4A" w:val="clear"/>
+          </w:tcPr>
+          <w:p>
+            <w:r>
+              <w:rPr>
+                <w:sz w:val="18"/>
+                <w:szCs w:val="18"/>
+                <w:color w:val="FFFFFF"/>
+                <w:b/>
+                <w:bCs/>
+              </w:rPr>
+              <w:t xml:space="preserve">Agent</w:t>
+            </w:r>
+          </w:p>
+        </w:tc>
+        <w:tc>
+          <w:tcPr>
+            <w:tcW w:w="0" w:type="auto"/>
+            <w:shd w:fill="1B2A4A" w:val="clear"/>
+          </w:tcPr>
+          <w:p>
+            <w:r>
+              <w:rPr>
+                <w:sz w:val="18"/>
+                <w:szCs w:val="18"/>
+                <w:color w:val="FFFFFF"/>
+                <w:b/>
+                <w:bCs/>
+              </w:rPr>
+              <w:t xml:space="preserve">Work Type</w:t>
+            </w:r>
+          </w:p>
+        </w:tc>
+        <w:tc>
+          <w:tcPr>
+            <w:tcW w:w="0" w:type="auto"/>
+            <w:shd w:fill="1B2A4A" w:val="clear"/>
+          </w:tcPr>
+          <w:p>
+            <w:r>
+              <w:rPr>
+                <w:sz w:val="18"/>
+                <w:szCs w:val="18"/>
+                <w:color w:val="FFFFFF"/>
+                <w:b/>
+                <w:bCs/>
+              </w:rPr>
+              <w:t xml:space="preserve">When to Use</w:t>
+            </w:r>
+          </w:p>
+        </w:tc>
+      </w:tr>
+      <w:tr>
+        <w:tc>
+          <w:tcPr>
+            <w:tcW w:w="0" w:type="auto"/>
+          </w:tcPr>
+          <w:p>
+            <w:r>
+              <w:rPr>
+                <w:sz w:val="18"/>
+                <w:szCs w:val="18"/>
+              </w:rPr>
+              <w:t xml:space="preserve">medical-writer</w:t>
+            </w:r>
+          </w:p>
+        </w:tc>
+        <w:tc>
+          <w:tcPr>
+            <w:tcW w:w="0" w:type="auto"/>
+          </w:tcPr>
+          <w:p>
+            <w:r>
+              <w:rPr>
+                <w:sz w:val="18"/>
+                <w:szCs w:val="18"/>
+              </w:rPr>
+              <w:t xml:space="preserve">Manuscripts, SLRs, medical summaries, congress materials</w:t>
+            </w:r>
+          </w:p>
+        </w:tc>
+        <w:tc>
+          <w:tcPr>
+            <w:tcW w:w="0" w:type="auto"/>
+          </w:tcPr>
+          <w:p>
+            <w:r>
+              <w:rPr>
+                <w:sz w:val="18"/>
+                <w:szCs w:val="18"/>
+              </w:rPr>
+              <w:t xml:space="preserve">Any scientific/medical written deliverable</w:t>
+            </w:r>
+          </w:p>
+        </w:tc>
+      </w:tr>
+      <w:tr>
+        <w:tc>
+          <w:tcPr>
+            <w:tcW w:w="0" w:type="auto"/>
+          </w:tcPr>
+          <w:p>
+            <w:r>
+              <w:rPr>
+                <w:sz w:val="18"/>
+                <w:szCs w:val="18"/>
+              </w:rPr>
+              <w:t xml:space="preserve">publication-planner</w:t>
+            </w:r>
+          </w:p>
+        </w:tc>
+        <w:tc>
+          <w:tcPr>
+            <w:tcW w:w="0" w:type="auto"/>
+          </w:tcPr>
+          <w:p>
+            <w:r>
+              <w:rPr>
+                <w:sz w:val="18"/>
+                <w:szCs w:val="18"/>
+              </w:rPr>
+              <w:t xml:space="preserve">Publication strategies, manuscript tracking, journal selection</w:t>
+            </w:r>
+          </w:p>
+        </w:tc>
+        <w:tc>
+          <w:tcPr>
+            <w:tcW w:w="0" w:type="auto"/>
+          </w:tcPr>
+          <w:p>
+            <w:r>
+              <w:rPr>
+                <w:sz w:val="18"/>
+                <w:szCs w:val="18"/>
+              </w:rPr>
+              <w:t xml:space="preserve">Publication lifecycle management</w:t>
+            </w:r>
+          </w:p>
+        </w:tc>
+      </w:tr>
+      <w:tr>
+        <w:tc>
+          <w:tcPr>
+            <w:tcW w:w="0" w:type="auto"/>
+          </w:tcPr>
+          <w:p>
+            <w:r>
+              <w:rPr>
+                <w:sz w:val="18"/>
+                <w:szCs w:val="18"/>
+              </w:rPr>
+              <w:t xml:space="preserve">value-dossier-builder</w:t>
+            </w:r>
+          </w:p>
+        </w:tc>
+        <w:tc>
+          <w:tcPr>
+            <w:tcW w:w="0" w:type="auto"/>
+          </w:tcPr>
+          <w:p>
+            <w:r>
+              <w:rPr>
+                <w:sz w:val="18"/>
+                <w:szCs w:val="18"/>
+              </w:rPr>
+              <w:t xml:space="preserve">AMCP dossiers, global value dossiers, payer toolkits</w:t>
+            </w:r>
+          </w:p>
+        </w:tc>
+        <w:tc>
+          <w:tcPr>
+            <w:tcW w:w="0" w:type="auto"/>
+          </w:tcPr>
+          <w:p>
+            <w:r>
+              <w:rPr>
+                <w:sz w:val="18"/>
+                <w:szCs w:val="18"/>
+              </w:rPr>
+              <w:t xml:space="preserve">Value evidence packages for payers</w:t>
+            </w:r>
+          </w:p>
+        </w:tc>
+      </w:tr>
+      <w:tr>
+        <w:tc>
+          <w:tcPr>
+            <w:tcW w:w="0" w:type="auto"/>
+          </w:tcPr>
+          <w:p>
+            <w:r>
+              <w:rPr>
+                <w:sz w:val="18"/>
+                <w:szCs w:val="18"/>
+              </w:rPr>
+              <w:t xml:space="preserve">HEOR-analyst</w:t>
+            </w:r>
+          </w:p>
+        </w:tc>
+        <w:tc>
+          <w:tcPr>
+            <w:tcW w:w="0" w:type="auto"/>
+          </w:tcPr>
+          <w:p>
+            <w:r>
+              <w:rPr>
+                <w:sz w:val="18"/>
+                <w:szCs w:val="18"/>
+              </w:rPr>
+              <w:t xml:space="preserve">Cost-effectiveness, budget impact, PRO strategy, RWE design</w:t>
+            </w:r>
+          </w:p>
+        </w:tc>
+        <w:tc>
+          <w:tcPr>
+            <w:tcW w:w="0" w:type="auto"/>
+          </w:tcPr>
+          <w:p>
+            <w:r>
+              <w:rPr>
+                <w:sz w:val="18"/>
+                <w:szCs w:val="18"/>
+              </w:rPr>
+              <w:t xml:space="preserve">Health economics and outcomes research</w:t>
+            </w:r>
+          </w:p>
+        </w:tc>
+      </w:tr>
+      <w:tr>
+        <w:tc>
+          <w:tcPr>
+            <w:tcW w:w="0" w:type="auto"/>
+          </w:tcPr>
+          <w:p>
+            <w:r>
+              <w:rPr>
+                <w:sz w:val="18"/>
+                <w:szCs w:val="18"/>
+              </w:rPr>
+              <w:t xml:space="preserve">advisory-board-designer</w:t>
+            </w:r>
+          </w:p>
+        </w:tc>
+        <w:tc>
+          <w:tcPr>
+            <w:tcW w:w="0" w:type="auto"/>
+          </w:tcPr>
+          <w:p>
+            <w:r>
+              <w:rPr>
+                <w:sz w:val="18"/>
+                <w:szCs w:val="18"/>
+              </w:rPr>
+              <w:t xml:space="preserve">Advisory board design, KOL meetings, medical education</w:t>
+            </w:r>
+          </w:p>
+        </w:tc>
+        <w:tc>
+          <w:tcPr>
+            <w:tcW w:w="0" w:type="auto"/>
+          </w:tcPr>
+          <w:p>
+            <w:r>
+              <w:rPr>
+                <w:sz w:val="18"/>
+                <w:szCs w:val="18"/>
+              </w:rPr>
+              <w:t xml:space="preserve">Meeting design and medical education</w:t>
+            </w:r>
+          </w:p>
+        </w:tc>
+      </w:tr>
+      <w:tr>
+        <w:tc>
+          <w:tcPr>
+            <w:tcW w:w="0" w:type="auto"/>
+          </w:tcPr>
+          <w:p>
+            <w:r>
+              <w:rPr>
+                <w:sz w:val="18"/>
+                <w:szCs w:val="18"/>
+              </w:rPr>
+              <w:t xml:space="preserve">congress-strategy-planner</w:t>
+            </w:r>
+          </w:p>
+        </w:tc>
+        <w:tc>
+          <w:tcPr>
+            <w:tcW w:w="0" w:type="auto"/>
+          </w:tcPr>
+          <w:p>
+            <w:r>
+              <w:rPr>
+                <w:sz w:val="18"/>
+                <w:szCs w:val="18"/>
+              </w:rPr>
+              <w:t xml:space="preserve">Congress plans, abstract prep, poster/presentation development</w:t>
+            </w:r>
+          </w:p>
+        </w:tc>
+        <w:tc>
+          <w:tcPr>
+            <w:tcW w:w="0" w:type="auto"/>
+          </w:tcPr>
+          <w:p>
+            <w:r>
+              <w:rPr>
+                <w:sz w:val="18"/>
+                <w:szCs w:val="18"/>
+              </w:rPr>
+              <w:t xml:space="preserve">Congress and conference deliverables</w:t>
+            </w:r>
+          </w:p>
+        </w:tc>
+      </w:tr>
+      <w:tr>
+        <w:tc>
+          <w:tcPr>
+            <w:tcW w:w="0" w:type="auto"/>
+          </w:tcPr>
+          <w:p>
+            <w:r>
+              <w:rPr>
+                <w:sz w:val="18"/>
+                <w:szCs w:val="18"/>
+              </w:rPr>
+              <w:t xml:space="preserve">decision-architect</w:t>
+            </w:r>
+          </w:p>
+        </w:tc>
+        <w:tc>
+          <w:tcPr>
+            <w:tcW w:w="0" w:type="auto"/>
+          </w:tcPr>
+          <w:p>
+            <w:r>
+              <w:rPr>
+                <w:sz w:val="18"/>
+                <w:szCs w:val="18"/>
+              </w:rPr>
+              <w:t xml:space="preserve">Evidence strategy decisions, resource allocation</w:t>
+            </w:r>
+          </w:p>
+        </w:tc>
+        <w:tc>
+          <w:tcPr>
+            <w:tcW w:w="0" w:type="auto"/>
+          </w:tcPr>
+          <w:p>
+            <w:r>
+              <w:rPr>
+                <w:sz w:val="18"/>
+                <w:szCs w:val="18"/>
+              </w:rPr>
+              <w:t xml:space="preserve">Choices with trade-offs needing frameworks</w:t>
+            </w:r>
+          </w:p>
+        </w:tc>
+      </w:tr>
+      <w:tr>
+        <w:tc>
+          <w:tcPr>
+            <w:tcW w:w="0" w:type="auto"/>
+          </w:tcPr>
+          <w:p>
+            <w:r>
+              <w:rPr>
+                <w:sz w:val="18"/>
+                <w:szCs w:val="18"/>
+              </w:rPr>
+              <w:t xml:space="preserve">payer-strategist</w:t>
+            </w:r>
+          </w:p>
+        </w:tc>
+        <w:tc>
+          <w:tcPr>
+            <w:tcW w:w="0" w:type="auto"/>
+          </w:tcPr>
+          <w:p>
+            <w:r>
+              <w:rPr>
+                <w:sz w:val="18"/>
+                <w:szCs w:val="18"/>
+              </w:rPr>
+              <w:t xml:space="preserve">HTA readiness, evidence gap action plans, payer engagement</w:t>
+            </w:r>
+          </w:p>
+        </w:tc>
+        <w:tc>
+          <w:tcPr>
+            <w:tcW w:w="0" w:type="auto"/>
+          </w:tcPr>
+          <w:p>
+            <w:r>
+              <w:rPr>
+                <w:sz w:val="18"/>
+                <w:szCs w:val="18"/>
+              </w:rPr>
+              <w:t xml:space="preserve">Payer-facing strategy and analysis</w:t>
+            </w:r>
+          </w:p>
+        </w:tc>
+      </w:tr>
+    </w:tbl>
+    <w:p>
+      <w:pPr>
+        <w:spacing w:after="120" w:before="60"/>
+      </w:pPr>
+      <w:r>
+        <w:t xml:space="preserve"/>
+      </w:r>
+    </w:p>
+    <w:p>
+      <w:pPr>
+        <w:pStyle w:val="Heading2"/>
+      </w:pPr>
+      <w:r>
+        <w:t>9.5 Review Agents (8)</w:t>
+      </w:r>
+    </w:p>
+    <w:tbl>
+      <w:tblPr>
+        <w:tblStyle w:val="TableGrid"/>
+        <w:tblW w:w="0" w:type="auto"/>
+      </w:tblPr>
+      <w:tblGrid>
+        <w:gridCol w:w="3116"/>
+        <w:gridCol w:w="3116"/>
+        <w:gridCol w:w="3116"/>
+      </w:tblGrid>
+      <w:tr>
+        <w:tc>
+          <w:tcPr>
+            <w:tcW w:w="0" w:type="auto"/>
+            <w:shd w:fill="1B2A4A" w:val="clear"/>
+          </w:tcPr>
+          <w:p>
+            <w:r>
+              <w:rPr>
+                <w:sz w:val="18"/>
+                <w:szCs w:val="18"/>
+                <w:color w:val="FFFFFF"/>
+                <w:b/>
+                <w:bCs/>
+              </w:rPr>
+              <w:t xml:space="preserve">Agent</w:t>
+            </w:r>
+          </w:p>
+        </w:tc>
+        <w:tc>
+          <w:tcPr>
+            <w:tcW w:w="0" w:type="auto"/>
+            <w:shd w:fill="1B2A4A" w:val="clear"/>
+          </w:tcPr>
+          <w:p>
+            <w:r>
+              <w:rPr>
+                <w:sz w:val="18"/>
+                <w:szCs w:val="18"/>
+                <w:color w:val="FFFFFF"/>
+                <w:b/>
+                <w:bCs/>
+              </w:rPr>
+              <w:t xml:space="preserve">What It Checks</w:t>
+            </w:r>
+          </w:p>
+        </w:tc>
+        <w:tc>
+          <w:tcPr>
+            <w:tcW w:w="0" w:type="auto"/>
+            <w:shd w:fill="1B2A4A" w:val="clear"/>
+          </w:tcPr>
+          <w:p>
+            <w:r>
+              <w:rPr>
+                <w:sz w:val="18"/>
+                <w:szCs w:val="18"/>
+                <w:color w:val="FFFFFF"/>
+                <w:b/>
+                <w:bCs/>
+              </w:rPr>
+              <w:t xml:space="preserve">Include For</w:t>
+            </w:r>
+          </w:p>
+        </w:tc>
+      </w:tr>
+      <w:tr>
+        <w:tc>
+          <w:tcPr>
+            <w:tcW w:w="0" w:type="auto"/>
+          </w:tcPr>
+          <w:p>
+            <w:r>
+              <w:rPr>
+                <w:sz w:val="18"/>
+                <w:szCs w:val="18"/>
+              </w:rPr>
+              <w:t xml:space="preserve">clarity-reviewer</w:t>
+            </w:r>
+          </w:p>
+        </w:tc>
+        <w:tc>
+          <w:tcPr>
+            <w:tcW w:w="0" w:type="auto"/>
+          </w:tcPr>
+          <w:p>
+            <w:r>
+              <w:rPr>
+                <w:sz w:val="18"/>
+                <w:szCs w:val="18"/>
+              </w:rPr>
+              <w:t xml:space="preserve">Structure, readability, scannability</w:t>
+            </w:r>
+          </w:p>
+        </w:tc>
+        <w:tc>
+          <w:tcPr>
+            <w:tcW w:w="0" w:type="auto"/>
+          </w:tcPr>
+          <w:p>
+            <w:r>
+              <w:rPr>
+                <w:sz w:val="18"/>
+                <w:szCs w:val="18"/>
+              </w:rPr>
+              <w:t xml:space="preserve">Always</w:t>
+            </w:r>
+          </w:p>
+        </w:tc>
+      </w:tr>
+      <w:tr>
+        <w:tc>
+          <w:tcPr>
+            <w:tcW w:w="0" w:type="auto"/>
+          </w:tcPr>
+          <w:p>
+            <w:r>
+              <w:rPr>
+                <w:sz w:val="18"/>
+                <w:szCs w:val="18"/>
+              </w:rPr>
+              <w:t xml:space="preserve">completeness-auditor</w:t>
+            </w:r>
+          </w:p>
+        </w:tc>
+        <w:tc>
+          <w:tcPr>
+            <w:tcW w:w="0" w:type="auto"/>
+          </w:tcPr>
+          <w:p>
+            <w:r>
+              <w:rPr>
+                <w:sz w:val="18"/>
+                <w:szCs w:val="18"/>
+              </w:rPr>
+              <w:t xml:space="preserve">Plan objectives, citations, sections, compliance checklists</w:t>
+            </w:r>
+          </w:p>
+        </w:tc>
+        <w:tc>
+          <w:tcPr>
+            <w:tcW w:w="0" w:type="auto"/>
+          </w:tcPr>
+          <w:p>
+            <w:r>
+              <w:rPr>
+                <w:sz w:val="18"/>
+                <w:szCs w:val="18"/>
+              </w:rPr>
+              <w:t xml:space="preserve">Always</w:t>
+            </w:r>
+          </w:p>
+        </w:tc>
+      </w:tr>
+      <w:tr>
+        <w:tc>
+          <w:tcPr>
+            <w:tcW w:w="0" w:type="auto"/>
+          </w:tcPr>
+          <w:p>
+            <w:r>
+              <w:rPr>
+                <w:sz w:val="18"/>
+                <w:szCs w:val="18"/>
+              </w:rPr>
+              <w:t xml:space="preserve">scientific-rigor-reviewer</w:t>
+            </w:r>
+          </w:p>
+        </w:tc>
+        <w:tc>
+          <w:tcPr>
+            <w:tcW w:w="0" w:type="auto"/>
+          </w:tcPr>
+          <w:p>
+            <w:r>
+              <w:rPr>
+                <w:sz w:val="18"/>
+                <w:szCs w:val="18"/>
+              </w:rPr>
+              <w:t xml:space="preserve">Evidence quality, statistics, cross-trial caveats</w:t>
+            </w:r>
+          </w:p>
+        </w:tc>
+        <w:tc>
+          <w:tcPr>
+            <w:tcW w:w="0" w:type="auto"/>
+          </w:tcPr>
+          <w:p>
+            <w:r>
+              <w:rPr>
+                <w:sz w:val="18"/>
+                <w:szCs w:val="18"/>
+              </w:rPr>
+              <w:t xml:space="preserve">All evidence-based deliverables</w:t>
+            </w:r>
+          </w:p>
+        </w:tc>
+      </w:tr>
+      <w:tr>
+        <w:tc>
+          <w:tcPr>
+            <w:tcW w:w="0" w:type="auto"/>
+          </w:tcPr>
+          <w:p>
+            <w:r>
+              <w:rPr>
+                <w:sz w:val="18"/>
+                <w:szCs w:val="18"/>
+              </w:rPr>
+              <w:t xml:space="preserve">ICMJE-compliance-reviewer</w:t>
+            </w:r>
+          </w:p>
+        </w:tc>
+        <w:tc>
+          <w:tcPr>
+            <w:tcW w:w="0" w:type="auto"/>
+          </w:tcPr>
+          <w:p>
+            <w:r>
+              <w:rPr>
+                <w:sz w:val="18"/>
+                <w:szCs w:val="18"/>
+              </w:rPr>
+              <w:t xml:space="preserve">Authorship criteria, GPP3, reporting standards</w:t>
+            </w:r>
+          </w:p>
+        </w:tc>
+        <w:tc>
+          <w:tcPr>
+            <w:tcW w:w="0" w:type="auto"/>
+          </w:tcPr>
+          <w:p>
+            <w:r>
+              <w:rPr>
+                <w:sz w:val="18"/>
+                <w:szCs w:val="18"/>
+              </w:rPr>
+              <w:t xml:space="preserve">Publication-related work</w:t>
+            </w:r>
+          </w:p>
+        </w:tc>
+      </w:tr>
+      <w:tr>
+        <w:tc>
+          <w:tcPr>
+            <w:tcW w:w="0" w:type="auto"/>
+          </w:tcPr>
+          <w:p>
+            <w:r>
+              <w:rPr>
+                <w:sz w:val="18"/>
+                <w:szCs w:val="18"/>
+              </w:rPr>
+              <w:t xml:space="preserve">promotional-review-checker</w:t>
+            </w:r>
+          </w:p>
+        </w:tc>
+        <w:tc>
+          <w:tcPr>
+            <w:tcW w:w="0" w:type="auto"/>
+          </w:tcPr>
+          <w:p>
+            <w:r>
+              <w:rPr>
+                <w:sz w:val="18"/>
+                <w:szCs w:val="18"/>
+              </w:rPr>
+              <w:t xml:space="preserve">Non-promotional language, fair balance, MLR readiness</w:t>
+            </w:r>
+          </w:p>
+        </w:tc>
+        <w:tc>
+          <w:tcPr>
+            <w:tcW w:w="0" w:type="auto"/>
+          </w:tcPr>
+          <w:p>
+            <w:r>
+              <w:rPr>
+                <w:sz w:val="18"/>
+                <w:szCs w:val="18"/>
+              </w:rPr>
+              <w:t xml:space="preserve">All external-facing deliverables</w:t>
+            </w:r>
+          </w:p>
+        </w:tc>
+      </w:tr>
+      <w:tr>
+        <w:tc>
+          <w:tcPr>
+            <w:tcW w:w="0" w:type="auto"/>
+          </w:tcPr>
+          <w:p>
+            <w:r>
+              <w:rPr>
+                <w:sz w:val="18"/>
+                <w:szCs w:val="18"/>
+              </w:rPr>
+              <w:t xml:space="preserve">payer-relevance-reviewer</w:t>
+            </w:r>
+          </w:p>
+        </w:tc>
+        <w:tc>
+          <w:tcPr>
+            <w:tcW w:w="0" w:type="auto"/>
+          </w:tcPr>
+          <w:p>
+            <w:r>
+              <w:rPr>
+                <w:sz w:val="18"/>
+                <w:szCs w:val="18"/>
+              </w:rPr>
+              <w:t xml:space="preserve">HTA evidence requirements, comparators, CHEERS</w:t>
+            </w:r>
+          </w:p>
+        </w:tc>
+        <w:tc>
+          <w:tcPr>
+            <w:tcW w:w="0" w:type="auto"/>
+          </w:tcPr>
+          <w:p>
+            <w:r>
+              <w:rPr>
+                <w:sz w:val="18"/>
+                <w:szCs w:val="18"/>
+              </w:rPr>
+              <w:t xml:space="preserve">Value dossiers, HEOR, payer materials</w:t>
+            </w:r>
+          </w:p>
+        </w:tc>
+      </w:tr>
+      <w:tr>
+        <w:tc>
+          <w:tcPr>
+            <w:tcW w:w="0" w:type="auto"/>
+          </w:tcPr>
+          <w:p>
+            <w:r>
+              <w:rPr>
+                <w:sz w:val="18"/>
+                <w:szCs w:val="18"/>
+              </w:rPr>
+              <w:t xml:space="preserve">devils-advocate</w:t>
+            </w:r>
+          </w:p>
+        </w:tc>
+        <w:tc>
+          <w:tcPr>
+            <w:tcW w:w="0" w:type="auto"/>
+          </w:tcPr>
+          <w:p>
+            <w:r>
+              <w:rPr>
+                <w:sz w:val="18"/>
+                <w:szCs w:val="18"/>
+              </w:rPr>
+              <w:t xml:space="preserve">Counter-arguments, blind spots, untested assumptions</w:t>
+            </w:r>
+          </w:p>
+        </w:tc>
+        <w:tc>
+          <w:tcPr>
+            <w:tcW w:w="0" w:type="auto"/>
+          </w:tcPr>
+          <w:p>
+            <w:r>
+              <w:rPr>
+                <w:sz w:val="18"/>
+                <w:szCs w:val="18"/>
+              </w:rPr>
+              <w:t xml:space="preserve">Board/Regulatory stakes only</w:t>
+            </w:r>
+          </w:p>
+        </w:tc>
+      </w:tr>
+      <w:tr>
+        <w:tc>
+          <w:tcPr>
+            <w:tcW w:w="0" w:type="auto"/>
+          </w:tcPr>
+          <w:p>
+            <w:r>
+              <w:rPr>
+                <w:sz w:val="18"/>
+                <w:szCs w:val="18"/>
+              </w:rPr>
+              <w:t xml:space="preserve">risk-assessor</w:t>
+            </w:r>
+          </w:p>
+        </w:tc>
+        <w:tc>
+          <w:tcPr>
+            <w:tcW w:w="0" w:type="auto"/>
+          </w:tcPr>
+          <w:p>
+            <w:r>
+              <w:rPr>
+                <w:sz w:val="18"/>
+                <w:szCs w:val="18"/>
+              </w:rPr>
+              <w:t xml:space="preserve">Compliance, scientific, reputational, competitive risks</w:t>
+            </w:r>
+          </w:p>
+        </w:tc>
+        <w:tc>
+          <w:tcPr>
+            <w:tcW w:w="0" w:type="auto"/>
+          </w:tcPr>
+          <w:p>
+            <w:r>
+              <w:rPr>
+                <w:sz w:val="18"/>
+                <w:szCs w:val="18"/>
+              </w:rPr>
+              <w:t xml:space="preserve">Board/Regulatory stakes only</w:t>
+            </w:r>
+          </w:p>
+        </w:tc>
+      </w:tr>
+    </w:tbl>
+    <w:p>
+      <w:pPr>
+        <w:spacing w:after="120" w:before="60"/>
+      </w:pPr>
+      <w:r>
+        <w:t xml:space="preserve"/>
+      </w:r>
+    </w:p>
+    <w:p>
+      <w:pPr>
+        <w:pStyle w:val="Heading2"/>
+      </w:pPr>
+      <w:r>
+        <w:t>9.6 Compliance Standards</w:t>
+      </w:r>
+    </w:p>
+    <w:p>
+      <w:pPr>
+        <w:spacing w:after="120" w:before="60"/>
+      </w:pPr>
+      <w:r>
+        <w:t xml:space="preserve">All Medical Affairs deliverables must comply with applicable standards. The standards file at standards/medical-affairs-documents.md defines the full requirements.</w:t>
+      </w:r>
+    </w:p>
+    <w:tbl>
+      <w:tblPr>
+        <w:tblStyle w:val="TableGrid"/>
+        <w:tblW w:w="0" w:type="auto"/>
+      </w:tblPr>
+      <w:tblGrid>
+        <w:gridCol w:w="3116"/>
+        <w:gridCol w:w="3116"/>
+        <w:gridCol w:w="3116"/>
+      </w:tblGrid>
+      <w:tr>
+        <w:tc>
+          <w:tcPr>
+            <w:tcW w:w="0" w:type="auto"/>
+            <w:shd w:fill="1B2A4A" w:val="clear"/>
+          </w:tcPr>
+          <w:p>
+            <w:r>
+              <w:rPr>
+                <w:sz w:val="18"/>
+                <w:szCs w:val="18"/>
+                <w:color w:val="FFFFFF"/>
+                <w:b/>
+                <w:bCs/>
+              </w:rPr>
+              <w:t xml:space="preserve">Standard</w:t>
+            </w:r>
+          </w:p>
+        </w:tc>
+        <w:tc>
+          <w:tcPr>
+            <w:tcW w:w="0" w:type="auto"/>
+            <w:shd w:fill="1B2A4A" w:val="clear"/>
+          </w:tcPr>
+          <w:p>
+            <w:r>
+              <w:rPr>
+                <w:sz w:val="18"/>
+                <w:szCs w:val="18"/>
+                <w:color w:val="FFFFFF"/>
+                <w:b/>
+                <w:bCs/>
+              </w:rPr>
+              <w:t xml:space="preserve">Applies To</w:t>
+            </w:r>
+          </w:p>
+        </w:tc>
+        <w:tc>
+          <w:tcPr>
+            <w:tcW w:w="0" w:type="auto"/>
+            <w:shd w:fill="1B2A4A" w:val="clear"/>
+          </w:tcPr>
+          <w:p>
+            <w:r>
+              <w:rPr>
+                <w:sz w:val="18"/>
+                <w:szCs w:val="18"/>
+                <w:color w:val="FFFFFF"/>
+                <w:b/>
+                <w:bCs/>
+              </w:rPr>
+              <w:t xml:space="preserve">Key Requirements</w:t>
+            </w:r>
+          </w:p>
+        </w:tc>
+      </w:tr>
+      <w:tr>
+        <w:tc>
+          <w:tcPr>
+            <w:tcW w:w="0" w:type="auto"/>
+          </w:tcPr>
+          <w:p>
+            <w:r>
+              <w:rPr>
+                <w:sz w:val="18"/>
+                <w:szCs w:val="18"/>
+              </w:rPr>
+              <w:t xml:space="preserve">ICMJE</w:t>
+            </w:r>
+          </w:p>
+        </w:tc>
+        <w:tc>
+          <w:tcPr>
+            <w:tcW w:w="0" w:type="auto"/>
+          </w:tcPr>
+          <w:p>
+            <w:r>
+              <w:rPr>
+                <w:sz w:val="18"/>
+                <w:szCs w:val="18"/>
+              </w:rPr>
+              <w:t xml:space="preserve">All publications</w:t>
+            </w:r>
+          </w:p>
+        </w:tc>
+        <w:tc>
+          <w:tcPr>
+            <w:tcW w:w="0" w:type="auto"/>
+          </w:tcPr>
+          <w:p>
+            <w:r>
+              <w:rPr>
+                <w:sz w:val="18"/>
+                <w:szCs w:val="18"/>
+              </w:rPr>
+              <w:t xml:space="preserve">Authorship criteria, disclosure, trial registration</w:t>
+            </w:r>
+          </w:p>
+        </w:tc>
+      </w:tr>
+      <w:tr>
+        <w:tc>
+          <w:tcPr>
+            <w:tcW w:w="0" w:type="auto"/>
+          </w:tcPr>
+          <w:p>
+            <w:r>
+              <w:rPr>
+                <w:sz w:val="18"/>
+                <w:szCs w:val="18"/>
+              </w:rPr>
+              <w:t xml:space="preserve">GPP3</w:t>
+            </w:r>
+          </w:p>
+        </w:tc>
+        <w:tc>
+          <w:tcPr>
+            <w:tcW w:w="0" w:type="auto"/>
+          </w:tcPr>
+          <w:p>
+            <w:r>
+              <w:rPr>
+                <w:sz w:val="18"/>
+                <w:szCs w:val="18"/>
+              </w:rPr>
+              <w:t xml:space="preserve">All publication-related work</w:t>
+            </w:r>
+          </w:p>
+        </w:tc>
+        <w:tc>
+          <w:tcPr>
+            <w:tcW w:w="0" w:type="auto"/>
+          </w:tcPr>
+          <w:p>
+            <w:r>
+              <w:rPr>
+                <w:sz w:val="18"/>
+                <w:szCs w:val="18"/>
+              </w:rPr>
+              <w:t xml:space="preserve">Non-promotional, balanced data, author involvement</w:t>
+            </w:r>
+          </w:p>
+        </w:tc>
+      </w:tr>
+      <w:tr>
+        <w:tc>
+          <w:tcPr>
+            <w:tcW w:w="0" w:type="auto"/>
+          </w:tcPr>
+          <w:p>
+            <w:r>
+              <w:rPr>
+                <w:sz w:val="18"/>
+                <w:szCs w:val="18"/>
+              </w:rPr>
+              <w:t xml:space="preserve">CHEERS 2022</w:t>
+            </w:r>
+          </w:p>
+        </w:tc>
+        <w:tc>
+          <w:tcPr>
+            <w:tcW w:w="0" w:type="auto"/>
+          </w:tcPr>
+          <w:p>
+            <w:r>
+              <w:rPr>
+                <w:sz w:val="18"/>
+                <w:szCs w:val="18"/>
+              </w:rPr>
+              <w:t xml:space="preserve">Health economic evaluations</w:t>
+            </w:r>
+          </w:p>
+        </w:tc>
+        <w:tc>
+          <w:tcPr>
+            <w:tcW w:w="0" w:type="auto"/>
+          </w:tcPr>
+          <w:p>
+            <w:r>
+              <w:rPr>
+                <w:sz w:val="18"/>
+                <w:szCs w:val="18"/>
+              </w:rPr>
+              <w:t xml:space="preserve">Perspective, time horizon, sensitivity analysis</w:t>
+            </w:r>
+          </w:p>
+        </w:tc>
+      </w:tr>
+      <w:tr>
+        <w:tc>
+          <w:tcPr>
+            <w:tcW w:w="0" w:type="auto"/>
+          </w:tcPr>
+          <w:p>
+            <w:r>
+              <w:rPr>
+                <w:sz w:val="18"/>
+                <w:szCs w:val="18"/>
+              </w:rPr>
+              <w:t xml:space="preserve">PRISMA 2020</w:t>
+            </w:r>
+          </w:p>
+        </w:tc>
+        <w:tc>
+          <w:tcPr>
+            <w:tcW w:w="0" w:type="auto"/>
+          </w:tcPr>
+          <w:p>
+            <w:r>
+              <w:rPr>
+                <w:sz w:val="18"/>
+                <w:szCs w:val="18"/>
+              </w:rPr>
+              <w:t xml:space="preserve">Systematic reviews</w:t>
+            </w:r>
+          </w:p>
+        </w:tc>
+        <w:tc>
+          <w:tcPr>
+            <w:tcW w:w="0" w:type="auto"/>
+          </w:tcPr>
+          <w:p>
+            <w:r>
+              <w:rPr>
+                <w:sz w:val="18"/>
+                <w:szCs w:val="18"/>
+              </w:rPr>
+              <w:t xml:space="preserve">Flow diagram, search strategy, risk of bias</w:t>
+            </w:r>
+          </w:p>
+        </w:tc>
+      </w:tr>
+      <w:tr>
+        <w:tc>
+          <w:tcPr>
+            <w:tcW w:w="0" w:type="auto"/>
+          </w:tcPr>
+          <w:p>
+            <w:r>
+              <w:rPr>
+                <w:sz w:val="18"/>
+                <w:szCs w:val="18"/>
+              </w:rPr>
+              <w:t xml:space="preserve">CONSORT</w:t>
+            </w:r>
+          </w:p>
+        </w:tc>
+        <w:tc>
+          <w:tcPr>
+            <w:tcW w:w="0" w:type="auto"/>
+          </w:tcPr>
+          <w:p>
+            <w:r>
+              <w:rPr>
+                <w:sz w:val="18"/>
+                <w:szCs w:val="18"/>
+              </w:rPr>
+              <w:t xml:space="preserve">RCT publications</w:t>
+            </w:r>
+          </w:p>
+        </w:tc>
+        <w:tc>
+          <w:tcPr>
+            <w:tcW w:w="0" w:type="auto"/>
+          </w:tcPr>
+          <w:p>
+            <w:r>
+              <w:rPr>
+                <w:sz w:val="18"/>
+                <w:szCs w:val="18"/>
+              </w:rPr>
+              <w:t xml:space="preserve">Flow diagram, ITT analysis, pre-specified endpoints</w:t>
+            </w:r>
+          </w:p>
+        </w:tc>
+      </w:tr>
+      <w:tr>
+        <w:tc>
+          <w:tcPr>
+            <w:tcW w:w="0" w:type="auto"/>
+          </w:tcPr>
+          <w:p>
+            <w:r>
+              <w:rPr>
+                <w:sz w:val="18"/>
+                <w:szCs w:val="18"/>
+              </w:rPr>
+              <w:t xml:space="preserve">STROBE</w:t>
+            </w:r>
+          </w:p>
+        </w:tc>
+        <w:tc>
+          <w:tcPr>
+            <w:tcW w:w="0" w:type="auto"/>
+          </w:tcPr>
+          <w:p>
+            <w:r>
+              <w:rPr>
+                <w:sz w:val="18"/>
+                <w:szCs w:val="18"/>
+              </w:rPr>
+              <w:t xml:space="preserve">Observational studies</w:t>
+            </w:r>
+          </w:p>
+        </w:tc>
+        <w:tc>
+          <w:tcPr>
+            <w:tcW w:w="0" w:type="auto"/>
+          </w:tcPr>
+          <w:p>
+            <w:r>
+              <w:rPr>
+                <w:sz w:val="18"/>
+                <w:szCs w:val="18"/>
+              </w:rPr>
+              <w:t xml:space="preserve">Study design, confounding, missing data</w:t>
+            </w:r>
+          </w:p>
+        </w:tc>
+      </w:tr>
+    </w:tbl>
+    <w:p>
+      <w:pPr>
+        <w:spacing w:after="120" w:before="60"/>
+      </w:pPr>
+      <w:r>
+        <w:t xml:space="preserve"/>
+      </w:r>
+    </w:p>
+    <w:p>
+      <w:pPr>
+        <w:pStyle w:val="Heading2"/>
+      </w:pPr>
+      <w:r>
+        <w:t>9.7 Evidence Hierarchy</w:t>
+      </w:r>
+    </w:p>
+    <w:p>
+      <w:pPr>
+        <w:spacing w:after="120" w:before="60"/>
+      </w:pPr>
+      <w:r>
+        <w:t xml:space="preserve">Every claim in a Medical Affairs deliverable must state its evidence level:</w:t>
+      </w:r>
+    </w:p>
+    <w:tbl>
+      <w:tblPr>
+        <w:tblStyle w:val="TableGrid"/>
+        <w:tblW w:w="0" w:type="auto"/>
+      </w:tblPr>
+      <w:tblGrid>
+        <w:gridCol w:w="3116"/>
+        <w:gridCol w:w="3116"/>
+        <w:gridCol w:w="3116"/>
+      </w:tblGrid>
+      <w:tr>
+        <w:tc>
+          <w:tcPr>
+            <w:tcW w:w="0" w:type="auto"/>
+            <w:shd w:fill="1B2A4A" w:val="clear"/>
+          </w:tcPr>
+          <w:p>
+            <w:r>
+              <w:rPr>
+                <w:sz w:val="18"/>
+                <w:szCs w:val="18"/>
+                <w:color w:val="FFFFFF"/>
+                <w:b/>
+                <w:bCs/>
+              </w:rPr>
+              <w:t xml:space="preserve">Level</w:t>
+            </w:r>
+          </w:p>
+        </w:tc>
+        <w:tc>
+          <w:tcPr>
+            <w:tcW w:w="0" w:type="auto"/>
+            <w:shd w:fill="1B2A4A" w:val="clear"/>
+          </w:tcPr>
+          <w:p>
+            <w:r>
+              <w:rPr>
+                <w:sz w:val="18"/>
+                <w:szCs w:val="18"/>
+                <w:color w:val="FFFFFF"/>
+                <w:b/>
+                <w:bCs/>
+              </w:rPr>
+              <w:t xml:space="preserve">Description</w:t>
+            </w:r>
+          </w:p>
+        </w:tc>
+        <w:tc>
+          <w:tcPr>
+            <w:tcW w:w="0" w:type="auto"/>
+            <w:shd w:fill="1B2A4A" w:val="clear"/>
+          </w:tcPr>
+          <w:p>
+            <w:r>
+              <w:rPr>
+                <w:sz w:val="18"/>
+                <w:szCs w:val="18"/>
+                <w:color w:val="FFFFFF"/>
+                <w:b/>
+                <w:bCs/>
+              </w:rPr>
+              <w:t xml:space="preserve">Example</w:t>
+            </w:r>
+          </w:p>
+        </w:tc>
+      </w:tr>
+      <w:tr>
+        <w:tc>
+          <w:tcPr>
+            <w:tcW w:w="0" w:type="auto"/>
+          </w:tcPr>
+          <w:p>
+            <w:r>
+              <w:rPr>
+                <w:sz w:val="18"/>
+                <w:szCs w:val="18"/>
+              </w:rPr>
+              <w:t xml:space="preserve">1a</w:t>
+            </w:r>
+          </w:p>
+        </w:tc>
+        <w:tc>
+          <w:tcPr>
+            <w:tcW w:w="0" w:type="auto"/>
+          </w:tcPr>
+          <w:p>
+            <w:r>
+              <w:rPr>
+                <w:sz w:val="18"/>
+                <w:szCs w:val="18"/>
+              </w:rPr>
+              <w:t xml:space="preserve">Systematic review of RCTs</w:t>
+            </w:r>
+          </w:p>
+        </w:tc>
+        <w:tc>
+          <w:tcPr>
+            <w:tcW w:w="0" w:type="auto"/>
+          </w:tcPr>
+          <w:p>
+            <w:r>
+              <w:rPr>
+                <w:sz w:val="18"/>
+                <w:szCs w:val="18"/>
+              </w:rPr>
+              <w:t xml:space="preserve">Cochrane review, published meta-analysis</w:t>
+            </w:r>
+          </w:p>
+        </w:tc>
+      </w:tr>
+      <w:tr>
+        <w:tc>
+          <w:tcPr>
+            <w:tcW w:w="0" w:type="auto"/>
+          </w:tcPr>
+          <w:p>
+            <w:r>
+              <w:rPr>
+                <w:sz w:val="18"/>
+                <w:szCs w:val="18"/>
+              </w:rPr>
+              <w:t xml:space="preserve">1b</w:t>
+            </w:r>
+          </w:p>
+        </w:tc>
+        <w:tc>
+          <w:tcPr>
+            <w:tcW w:w="0" w:type="auto"/>
+          </w:tcPr>
+          <w:p>
+            <w:r>
+              <w:rPr>
+                <w:sz w:val="18"/>
+                <w:szCs w:val="18"/>
+              </w:rPr>
+              <w:t xml:space="preserve">Individual RCT</w:t>
+            </w:r>
+          </w:p>
+        </w:tc>
+        <w:tc>
+          <w:tcPr>
+            <w:tcW w:w="0" w:type="auto"/>
+          </w:tcPr>
+          <w:p>
+            <w:r>
+              <w:rPr>
+                <w:sz w:val="18"/>
+                <w:szCs w:val="18"/>
+              </w:rPr>
+              <w:t xml:space="preserve">Phase 3 pivotal trial</w:t>
+            </w:r>
+          </w:p>
+        </w:tc>
+      </w:tr>
+      <w:tr>
+        <w:tc>
+          <w:tcPr>
+            <w:tcW w:w="0" w:type="auto"/>
+          </w:tcPr>
+          <w:p>
+            <w:r>
+              <w:rPr>
+                <w:sz w:val="18"/>
+                <w:szCs w:val="18"/>
+              </w:rPr>
+              <w:t xml:space="preserve">2a</w:t>
+            </w:r>
+          </w:p>
+        </w:tc>
+        <w:tc>
+          <w:tcPr>
+            <w:tcW w:w="0" w:type="auto"/>
+          </w:tcPr>
+          <w:p>
+            <w:r>
+              <w:rPr>
+                <w:sz w:val="18"/>
+                <w:szCs w:val="18"/>
+              </w:rPr>
+              <w:t xml:space="preserve">Systematic review of cohort studies</w:t>
+            </w:r>
+          </w:p>
+        </w:tc>
+        <w:tc>
+          <w:tcPr>
+            <w:tcW w:w="0" w:type="auto"/>
+          </w:tcPr>
+          <w:p>
+            <w:r>
+              <w:rPr>
+                <w:sz w:val="18"/>
+                <w:szCs w:val="18"/>
+              </w:rPr>
+              <w:t xml:space="preserve">Published systematic review of observational data</w:t>
+            </w:r>
+          </w:p>
+        </w:tc>
+      </w:tr>
+      <w:tr>
+        <w:tc>
+          <w:tcPr>
+            <w:tcW w:w="0" w:type="auto"/>
+          </w:tcPr>
+          <w:p>
+            <w:r>
+              <w:rPr>
+                <w:sz w:val="18"/>
+                <w:szCs w:val="18"/>
+              </w:rPr>
+              <w:t xml:space="preserve">2b</w:t>
+            </w:r>
+          </w:p>
+        </w:tc>
+        <w:tc>
+          <w:tcPr>
+            <w:tcW w:w="0" w:type="auto"/>
+          </w:tcPr>
+          <w:p>
+            <w:r>
+              <w:rPr>
+                <w:sz w:val="18"/>
+                <w:szCs w:val="18"/>
+              </w:rPr>
+              <w:t xml:space="preserve">Individual cohort / low-quality RCT</w:t>
+            </w:r>
+          </w:p>
+        </w:tc>
+        <w:tc>
+          <w:tcPr>
+            <w:tcW w:w="0" w:type="auto"/>
+          </w:tcPr>
+          <w:p>
+            <w:r>
+              <w:rPr>
+                <w:sz w:val="18"/>
+                <w:szCs w:val="18"/>
+              </w:rPr>
+              <w:t xml:space="preserve">Phase 2, observational study</w:t>
+            </w:r>
+          </w:p>
+        </w:tc>
+      </w:tr>
+      <w:tr>
+        <w:tc>
+          <w:tcPr>
+            <w:tcW w:w="0" w:type="auto"/>
+          </w:tcPr>
+          <w:p>
+            <w:r>
+              <w:rPr>
+                <w:sz w:val="18"/>
+                <w:szCs w:val="18"/>
+              </w:rPr>
+              <w:t xml:space="preserve">3</w:t>
+            </w:r>
+          </w:p>
+        </w:tc>
+        <w:tc>
+          <w:tcPr>
+            <w:tcW w:w="0" w:type="auto"/>
+          </w:tcPr>
+          <w:p>
+            <w:r>
+              <w:rPr>
+                <w:sz w:val="18"/>
+                <w:szCs w:val="18"/>
+              </w:rPr>
+              <w:t xml:space="preserve">Case-control study</w:t>
+            </w:r>
+          </w:p>
+        </w:tc>
+        <w:tc>
+          <w:tcPr>
+            <w:tcW w:w="0" w:type="auto"/>
+          </w:tcPr>
+          <w:p>
+            <w:r>
+              <w:rPr>
+                <w:sz w:val="18"/>
+                <w:szCs w:val="18"/>
+              </w:rPr>
+              <w:t xml:space="preserve">Retrospective case-control</w:t>
+            </w:r>
+          </w:p>
+        </w:tc>
+      </w:tr>
+      <w:tr>
+        <w:tc>
+          <w:tcPr>
+            <w:tcW w:w="0" w:type="auto"/>
+          </w:tcPr>
+          <w:p>
+            <w:r>
+              <w:rPr>
+                <w:sz w:val="18"/>
+                <w:szCs w:val="18"/>
+              </w:rPr>
+              <w:t xml:space="preserve">4</w:t>
+            </w:r>
+          </w:p>
+        </w:tc>
+        <w:tc>
+          <w:tcPr>
+            <w:tcW w:w="0" w:type="auto"/>
+          </w:tcPr>
+          <w:p>
+            <w:r>
+              <w:rPr>
+                <w:sz w:val="18"/>
+                <w:szCs w:val="18"/>
+              </w:rPr>
+              <w:t xml:space="preserve">Case series / case report</w:t>
+            </w:r>
+          </w:p>
+        </w:tc>
+        <w:tc>
+          <w:tcPr>
+            <w:tcW w:w="0" w:type="auto"/>
+          </w:tcPr>
+          <w:p>
+            <w:r>
+              <w:rPr>
+                <w:sz w:val="18"/>
+                <w:szCs w:val="18"/>
+              </w:rPr>
+              <w:t xml:space="preserve">Published case series</w:t>
+            </w:r>
+          </w:p>
+        </w:tc>
+      </w:tr>
+      <w:tr>
+        <w:tc>
+          <w:tcPr>
+            <w:tcW w:w="0" w:type="auto"/>
+          </w:tcPr>
+          <w:p>
+            <w:r>
+              <w:rPr>
+                <w:sz w:val="18"/>
+                <w:szCs w:val="18"/>
+              </w:rPr>
+              <w:t xml:space="preserve">5</w:t>
+            </w:r>
+          </w:p>
+        </w:tc>
+        <w:tc>
+          <w:tcPr>
+            <w:tcW w:w="0" w:type="auto"/>
+          </w:tcPr>
+          <w:p>
+            <w:r>
+              <w:rPr>
+                <w:sz w:val="18"/>
+                <w:szCs w:val="18"/>
+              </w:rPr>
+              <w:t xml:space="preserve">Expert opinion</w:t>
+            </w:r>
+          </w:p>
+        </w:tc>
+        <w:tc>
+          <w:tcPr>
+            <w:tcW w:w="0" w:type="auto"/>
+          </w:tcPr>
+          <w:p>
+            <w:r>
+              <w:rPr>
+                <w:sz w:val="18"/>
+                <w:szCs w:val="18"/>
+              </w:rPr>
+              <w:t xml:space="preserve">KOL opinion, preclinical rationale</w:t>
+            </w:r>
+          </w:p>
+        </w:tc>
+      </w:tr>
+      <w:tr>
+        <w:tc>
+          <w:tcPr>
+            <w:tcW w:w="0" w:type="auto"/>
+          </w:tcPr>
+          <w:p>
+            <w:r>
+              <w:rPr>
+                <w:sz w:val="18"/>
+                <w:szCs w:val="18"/>
+              </w:rPr>
+              <w:t xml:space="preserve">Preprint</w:t>
+            </w:r>
+          </w:p>
+        </w:tc>
+        <w:tc>
+          <w:tcPr>
+            <w:tcW w:w="0" w:type="auto"/>
+          </w:tcPr>
+          <w:p>
+            <w:r>
+              <w:rPr>
+                <w:sz w:val="18"/>
+                <w:szCs w:val="18"/>
+              </w:rPr>
+              <w:t xml:space="preserve">Not peer-reviewed</w:t>
+            </w:r>
+          </w:p>
+        </w:tc>
+        <w:tc>
+          <w:tcPr>
+            <w:tcW w:w="0" w:type="auto"/>
+          </w:tcPr>
+          <w:p>
+            <w:r>
+              <w:rPr>
+                <w:sz w:val="18"/>
+                <w:szCs w:val="18"/>
+              </w:rPr>
+              <w:t xml:space="preserve">bioRxiv/medRxiv — must be flagged</w:t>
+            </w:r>
+          </w:p>
+        </w:tc>
+      </w:tr>
+    </w:tbl>
+    <w:p>
+      <w:pPr>
+        <w:spacing w:after="120" w:before="60"/>
+      </w:pPr>
+      <w:r>
+        <w:t xml:space="preserve"/>
+      </w:r>
+    </w:p>
+    <w:p>
+      <w:pPr>
+        <w:pStyle w:val="Heading2"/>
+      </w:pPr>
+      <w:r>
+        <w:t>9.8 MCP Tool Integration</w:t>
+      </w:r>
+    </w:p>
+    <w:p>
+      <w:pPr>
+        <w:spacing w:after="120" w:before="60"/>
+      </w:pPr>
+      <w:r>
+        <w:t xml:space="preserve">The same MCP tools from the pharma/biotech plugin are used, but wired to different agents:</w:t>
+      </w:r>
+    </w:p>
+    <w:tbl>
+      <w:tblPr>
+        <w:tblStyle w:val="TableGrid"/>
+        <w:tblW w:w="0" w:type="auto"/>
+      </w:tblPr>
+      <w:tblGrid>
+        <w:gridCol w:w="3116"/>
+        <w:gridCol w:w="3116"/>
+        <w:gridCol w:w="3116"/>
+      </w:tblGrid>
+      <w:tr>
+        <w:tc>
+          <w:tcPr>
+            <w:tcW w:w="0" w:type="auto"/>
+            <w:shd w:fill="1B2A4A" w:val="clear"/>
+          </w:tcPr>
+          <w:p>
+            <w:r>
+              <w:rPr>
+                <w:sz w:val="18"/>
+                <w:szCs w:val="18"/>
+                <w:color w:val="FFFFFF"/>
+                <w:b/>
+                <w:bCs/>
+              </w:rPr>
+              <w:t xml:space="preserve">Database</w:t>
+            </w:r>
+          </w:p>
+        </w:tc>
+        <w:tc>
+          <w:tcPr>
+            <w:tcW w:w="0" w:type="auto"/>
+            <w:shd w:fill="1B2A4A" w:val="clear"/>
+          </w:tcPr>
+          <w:p>
+            <w:r>
+              <w:rPr>
+                <w:sz w:val="18"/>
+                <w:szCs w:val="18"/>
+                <w:color w:val="FFFFFF"/>
+                <w:b/>
+                <w:bCs/>
+              </w:rPr>
+              <w:t xml:space="preserve">What It Provides</w:t>
+            </w:r>
+          </w:p>
+        </w:tc>
+        <w:tc>
+          <w:tcPr>
+            <w:tcW w:w="0" w:type="auto"/>
+            <w:shd w:fill="1B2A4A" w:val="clear"/>
+          </w:tcPr>
+          <w:p>
+            <w:r>
+              <w:rPr>
+                <w:sz w:val="18"/>
+                <w:szCs w:val="18"/>
+                <w:color w:val="FFFFFF"/>
+                <w:b/>
+                <w:bCs/>
+              </w:rPr>
+              <w:t xml:space="preserve">Used By</w:t>
+            </w:r>
+          </w:p>
+        </w:tc>
+      </w:tr>
+      <w:tr>
+        <w:tc>
+          <w:tcPr>
+            <w:tcW w:w="0" w:type="auto"/>
+          </w:tcPr>
+          <w:p>
+            <w:r>
+              <w:rPr>
+                <w:sz w:val="18"/>
+                <w:szCs w:val="18"/>
+              </w:rPr>
+              <w:t xml:space="preserve">PubMed</w:t>
+            </w:r>
+          </w:p>
+        </w:tc>
+        <w:tc>
+          <w:tcPr>
+            <w:tcW w:w="0" w:type="auto"/>
+          </w:tcPr>
+          <w:p>
+            <w:r>
+              <w:rPr>
+                <w:sz w:val="18"/>
+                <w:szCs w:val="18"/>
+              </w:rPr>
+              <w:t xml:space="preserve">Published literature, clinical trial results, systematic reviews</w:t>
+            </w:r>
+          </w:p>
+        </w:tc>
+        <w:tc>
+          <w:tcPr>
+            <w:tcW w:w="0" w:type="auto"/>
+          </w:tcPr>
+          <w:p>
+            <w:r>
+              <w:rPr>
+                <w:sz w:val="18"/>
+                <w:szCs w:val="18"/>
+              </w:rPr>
+              <w:t xml:space="preserve">evidence-synthesizer, publication-landscape-scout</w:t>
+            </w:r>
+          </w:p>
+        </w:tc>
+      </w:tr>
+      <w:tr>
+        <w:tc>
+          <w:tcPr>
+            <w:tcW w:w="0" w:type="auto"/>
+          </w:tcPr>
+          <w:p>
+            <w:r>
+              <w:rPr>
+                <w:sz w:val="18"/>
+                <w:szCs w:val="18"/>
+              </w:rPr>
+              <w:t xml:space="preserve">bioRxiv / medRxiv</w:t>
+            </w:r>
+          </w:p>
+        </w:tc>
+        <w:tc>
+          <w:tcPr>
+            <w:tcW w:w="0" w:type="auto"/>
+          </w:tcPr>
+          <w:p>
+            <w:r>
+              <w:rPr>
+                <w:sz w:val="18"/>
+                <w:szCs w:val="18"/>
+              </w:rPr>
+              <w:t xml:space="preserve">Preprints before peer review</w:t>
+            </w:r>
+          </w:p>
+        </w:tc>
+        <w:tc>
+          <w:tcPr>
+            <w:tcW w:w="0" w:type="auto"/>
+          </w:tcPr>
+          <w:p>
+            <w:r>
+              <w:rPr>
+                <w:sz w:val="18"/>
+                <w:szCs w:val="18"/>
+              </w:rPr>
+              <w:t xml:space="preserve">evidence-synthesizer, publication-landscape-scout</w:t>
+            </w:r>
+          </w:p>
+        </w:tc>
+      </w:tr>
+      <w:tr>
+        <w:tc>
+          <w:tcPr>
+            <w:tcW w:w="0" w:type="auto"/>
+          </w:tcPr>
+          <w:p>
+            <w:r>
+              <w:rPr>
+                <w:sz w:val="18"/>
+                <w:szCs w:val="18"/>
+              </w:rPr>
+              <w:t xml:space="preserve">ClinicalTrials.gov</w:t>
+            </w:r>
+          </w:p>
+        </w:tc>
+        <w:tc>
+          <w:tcPr>
+            <w:tcW w:w="0" w:type="auto"/>
+          </w:tcPr>
+          <w:p>
+            <w:r>
+              <w:rPr>
+                <w:sz w:val="18"/>
+                <w:szCs w:val="18"/>
+              </w:rPr>
+              <w:t xml:space="preserve">Trial landscape, endpoints, investigators</w:t>
+            </w:r>
+          </w:p>
+        </w:tc>
+        <w:tc>
+          <w:tcPr>
+            <w:tcW w:w="0" w:type="auto"/>
+          </w:tcPr>
+          <w:p>
+            <w:r>
+              <w:rPr>
+                <w:sz w:val="18"/>
+                <w:szCs w:val="18"/>
+              </w:rPr>
+              <w:t xml:space="preserve">evidence-synthesizer, competitor-evidence-tracker</w:t>
+            </w:r>
+          </w:p>
+        </w:tc>
+      </w:tr>
+      <w:tr>
+        <w:tc>
+          <w:tcPr>
+            <w:tcW w:w="0" w:type="auto"/>
+          </w:tcPr>
+          <w:p>
+            <w:r>
+              <w:rPr>
+                <w:sz w:val="18"/>
+                <w:szCs w:val="18"/>
+              </w:rPr>
+              <w:t xml:space="preserve">ChEMBL</w:t>
+            </w:r>
+          </w:p>
+        </w:tc>
+        <w:tc>
+          <w:tcPr>
+            <w:tcW w:w="0" w:type="auto"/>
+          </w:tcPr>
+          <w:p>
+            <w:r>
+              <w:rPr>
+                <w:sz w:val="18"/>
+                <w:szCs w:val="18"/>
+              </w:rPr>
+              <w:t xml:space="preserve">Compound profiles, target biology, drug mechanisms</w:t>
+            </w:r>
+          </w:p>
+        </w:tc>
+        <w:tc>
+          <w:tcPr>
+            <w:tcW w:w="0" w:type="auto"/>
+          </w:tcPr>
+          <w:p>
+            <w:r>
+              <w:rPr>
+                <w:sz w:val="18"/>
+                <w:szCs w:val="18"/>
+              </w:rPr>
+              <w:t xml:space="preserve">competitor-evidence-tracker</w:t>
+            </w:r>
+          </w:p>
+        </w:tc>
+      </w:tr>
+      <w:tr>
+        <w:tc>
+          <w:tcPr>
+            <w:tcW w:w="0" w:type="auto"/>
+          </w:tcPr>
+          <w:p>
+            <w:r>
+              <w:rPr>
+                <w:sz w:val="18"/>
+                <w:szCs w:val="18"/>
+              </w:rPr>
+              <w:t xml:space="preserve">Open Targets</w:t>
+            </w:r>
+          </w:p>
+        </w:tc>
+        <w:tc>
+          <w:tcPr>
+            <w:tcW w:w="0" w:type="auto"/>
+          </w:tcPr>
+          <w:p>
+            <w:r>
+              <w:rPr>
+                <w:sz w:val="18"/>
+                <w:szCs w:val="18"/>
+              </w:rPr>
+              <w:t xml:space="preserve">Target-disease associations, genetic evidence</w:t>
+            </w:r>
+          </w:p>
+        </w:tc>
+        <w:tc>
+          <w:tcPr>
+            <w:tcW w:w="0" w:type="auto"/>
+          </w:tcPr>
+          <w:p>
+            <w:r>
+              <w:rPr>
+                <w:sz w:val="18"/>
+                <w:szCs w:val="18"/>
+              </w:rPr>
+              <w:t xml:space="preserve">competitor-evidence-tracker</w:t>
+            </w:r>
+          </w:p>
+        </w:tc>
+      </w:tr>
+    </w:tbl>
+    <w:p>
+      <w:pPr>
+        <w:spacing w:after="120" w:before="60"/>
+      </w:pPr>
+      <w:r>
+        <w:t xml:space="preserve"/>
+      </w:r>
+    </w:p>
+    <w:p>
+      <w:pPr>
+        <w:pStyle w:val="Heading2"/>
+      </w:pPr>
+      <w:r>
+        <w:t>9.9 Stakes-Based Progressive Loading</w:t>
+      </w:r>
+    </w:p>
+    <w:tbl>
+      <w:tblPr>
+        <w:tblStyle w:val="TableGrid"/>
+        <w:tblW w:w="0" w:type="auto"/>
+      </w:tblPr>
+      <w:tblGrid>
+        <w:gridCol w:w="2337"/>
+        <w:gridCol w:w="2337"/>
+        <w:gridCol w:w="2337"/>
+        <w:gridCol w:w="2337"/>
+      </w:tblGrid>
+      <w:tr>
+        <w:tc>
+          <w:tcPr>
+            <w:tcW w:w="0" w:type="auto"/>
+            <w:shd w:fill="1B2A4A" w:val="clear"/>
+          </w:tcPr>
+          <w:p>
+            <w:r>
+              <w:rPr>
+                <w:sz w:val="18"/>
+                <w:szCs w:val="18"/>
+                <w:color w:val="FFFFFF"/>
+                <w:b/>
+                <w:bCs/>
+              </w:rPr>
+              <w:t xml:space="preserve">Stakes Level</w:t>
+            </w:r>
+          </w:p>
+        </w:tc>
+        <w:tc>
+          <w:tcPr>
+            <w:tcW w:w="0" w:type="auto"/>
+            <w:shd w:fill="1B2A4A" w:val="clear"/>
+          </w:tcPr>
+          <w:p>
+            <w:r>
+              <w:rPr>
+                <w:sz w:val="18"/>
+                <w:szCs w:val="18"/>
+                <w:color w:val="FFFFFF"/>
+                <w:b/>
+                <w:bCs/>
+              </w:rPr>
+              <w:t xml:space="preserve">When</w:t>
+            </w:r>
+          </w:p>
+        </w:tc>
+        <w:tc>
+          <w:tcPr>
+            <w:tcW w:w="0" w:type="auto"/>
+            <w:shd w:fill="1B2A4A" w:val="clear"/>
+          </w:tcPr>
+          <w:p>
+            <w:r>
+              <w:rPr>
+                <w:sz w:val="18"/>
+                <w:szCs w:val="18"/>
+                <w:color w:val="FFFFFF"/>
+                <w:b/>
+                <w:bCs/>
+              </w:rPr>
+              <w:t xml:space="preserve">Research Agents</w:t>
+            </w:r>
+          </w:p>
+        </w:tc>
+        <w:tc>
+          <w:tcPr>
+            <w:tcW w:w="0" w:type="auto"/>
+            <w:shd w:fill="1B2A4A" w:val="clear"/>
+          </w:tcPr>
+          <w:p>
+            <w:r>
+              <w:rPr>
+                <w:sz w:val="18"/>
+                <w:szCs w:val="18"/>
+                <w:color w:val="FFFFFF"/>
+                <w:b/>
+                <w:bCs/>
+              </w:rPr>
+              <w:t xml:space="preserve">Review Agents</w:t>
+            </w:r>
+          </w:p>
+        </w:tc>
+      </w:tr>
+      <w:tr>
+        <w:tc>
+          <w:tcPr>
+            <w:tcW w:w="0" w:type="auto"/>
+          </w:tcPr>
+          <w:p>
+            <w:r>
+              <w:rPr>
+                <w:sz w:val="18"/>
+                <w:szCs w:val="18"/>
+              </w:rPr>
+              <w:t xml:space="preserve">Routine</w:t>
+            </w:r>
+          </w:p>
+        </w:tc>
+        <w:tc>
+          <w:tcPr>
+            <w:tcW w:w="0" w:type="auto"/>
+          </w:tcPr>
+          <w:p>
+            <w:r>
+              <w:rPr>
+                <w:sz w:val="18"/>
+                <w:szCs w:val="18"/>
+              </w:rPr>
+              <w:t xml:space="preserve">Internal notes, quick lookups</w:t>
+            </w:r>
+          </w:p>
+        </w:tc>
+        <w:tc>
+          <w:tcPr>
+            <w:tcW w:w="0" w:type="auto"/>
+          </w:tcPr>
+          <w:p>
+            <w:r>
+              <w:rPr>
+                <w:sz w:val="18"/>
+                <w:szCs w:val="18"/>
+              </w:rPr>
+              <w:t xml:space="preserve">Context-gatherer only</w:t>
+            </w:r>
+          </w:p>
+        </w:tc>
+        <w:tc>
+          <w:tcPr>
+            <w:tcW w:w="0" w:type="auto"/>
+          </w:tcPr>
+          <w:p>
+            <w:r>
+              <w:rPr>
+                <w:sz w:val="18"/>
+                <w:szCs w:val="18"/>
+              </w:rPr>
+              <w:t xml:space="preserve">None</w:t>
+            </w:r>
+          </w:p>
+        </w:tc>
+      </w:tr>
+      <w:tr>
+        <w:tc>
+          <w:tcPr>
+            <w:tcW w:w="0" w:type="auto"/>
+          </w:tcPr>
+          <w:p>
+            <w:r>
+              <w:rPr>
+                <w:sz w:val="18"/>
+                <w:szCs w:val="18"/>
+              </w:rPr>
+              <w:t xml:space="preserve">Standard</w:t>
+            </w:r>
+          </w:p>
+        </w:tc>
+        <w:tc>
+          <w:tcPr>
+            <w:tcW w:w="0" w:type="auto"/>
+          </w:tcPr>
+          <w:p>
+            <w:r>
+              <w:rPr>
+                <w:sz w:val="18"/>
+                <w:szCs w:val="18"/>
+              </w:rPr>
+              <w:t xml:space="preserve">Team comms, standard lit reviews</w:t>
+            </w:r>
+          </w:p>
+        </w:tc>
+        <w:tc>
+          <w:tcPr>
+            <w:tcW w:w="0" w:type="auto"/>
+          </w:tcPr>
+          <w:p>
+            <w:r>
+              <w:rPr>
+                <w:sz w:val="18"/>
+                <w:szCs w:val="18"/>
+              </w:rPr>
+              <w:t xml:space="preserve">2-3 domain agents</w:t>
+            </w:r>
+          </w:p>
+        </w:tc>
+        <w:tc>
+          <w:tcPr>
+            <w:tcW w:w="0" w:type="auto"/>
+          </w:tcPr>
+          <w:p>
+            <w:r>
+              <w:rPr>
+                <w:sz w:val="18"/>
+                <w:szCs w:val="18"/>
+              </w:rPr>
+              <w:t xml:space="preserve">2-3 (core + 1 domain)</w:t>
+            </w:r>
+          </w:p>
+        </w:tc>
+      </w:tr>
+      <w:tr>
+        <w:tc>
+          <w:tcPr>
+            <w:tcW w:w="0" w:type="auto"/>
+          </w:tcPr>
+          <w:p>
+            <w:r>
+              <w:rPr>
+                <w:sz w:val="18"/>
+                <w:szCs w:val="18"/>
+              </w:rPr>
+              <w:t xml:space="preserve">High-Stakes</w:t>
+            </w:r>
+          </w:p>
+        </w:tc>
+        <w:tc>
+          <w:tcPr>
+            <w:tcW w:w="0" w:type="auto"/>
+          </w:tcPr>
+          <w:p>
+            <w:r>
+              <w:rPr>
+                <w:sz w:val="18"/>
+                <w:szCs w:val="18"/>
+              </w:rPr>
+              <w:t xml:space="preserve">HTA submissions, value dossiers, publication plans</w:t>
+            </w:r>
+          </w:p>
+        </w:tc>
+        <w:tc>
+          <w:tcPr>
+            <w:tcW w:w="0" w:type="auto"/>
+          </w:tcPr>
+          <w:p>
+            <w:r>
+              <w:rPr>
+                <w:sz w:val="18"/>
+                <w:szCs w:val="18"/>
+              </w:rPr>
+              <w:t xml:space="preserve">Full domain roster</w:t>
+            </w:r>
+          </w:p>
+        </w:tc>
+        <w:tc>
+          <w:tcPr>
+            <w:tcW w:w="0" w:type="auto"/>
+          </w:tcPr>
+          <w:p>
+            <w:r>
+              <w:rPr>
+                <w:sz w:val="18"/>
+                <w:szCs w:val="18"/>
+              </w:rPr>
+              <w:t xml:space="preserve">5-6 (core + domain)</w:t>
+            </w:r>
+          </w:p>
+        </w:tc>
+      </w:tr>
+      <w:tr>
+        <w:tc>
+          <w:tcPr>
+            <w:tcW w:w="0" w:type="auto"/>
+          </w:tcPr>
+          <w:p>
+            <w:r>
+              <w:rPr>
+                <w:sz w:val="18"/>
+                <w:szCs w:val="18"/>
+              </w:rPr>
+              <w:t xml:space="preserve">Board/Regulatory</w:t>
+            </w:r>
+          </w:p>
+        </w:tc>
+        <w:tc>
+          <w:tcPr>
+            <w:tcW w:w="0" w:type="auto"/>
+          </w:tcPr>
+          <w:p>
+            <w:r>
+              <w:rPr>
+                <w:sz w:val="18"/>
+                <w:szCs w:val="18"/>
+              </w:rPr>
+              <w:t xml:space="preserve">AMCP dossiers, NICE submissions, regulatory docs</w:t>
+            </w:r>
+          </w:p>
+        </w:tc>
+        <w:tc>
+          <w:tcPr>
+            <w:tcW w:w="0" w:type="auto"/>
+          </w:tcPr>
+          <w:p>
+            <w:r>
+              <w:rPr>
+                <w:sz w:val="18"/>
+                <w:szCs w:val="18"/>
+              </w:rPr>
+              <w:t xml:space="preserve">All agents + constraints</w:t>
+            </w:r>
+          </w:p>
+        </w:tc>
+        <w:tc>
+          <w:tcPr>
+            <w:tcW w:w="0" w:type="auto"/>
+          </w:tcPr>
+          <w:p>
+            <w:r>
+              <w:rPr>
+                <w:sz w:val="18"/>
+                <w:szCs w:val="18"/>
+              </w:rPr>
+              <w:t xml:space="preserve">All 8 including stress tests</w:t>
+            </w:r>
+          </w:p>
+        </w:tc>
+      </w:tr>
+    </w:tbl>
+    <w:p>
+      <w:pPr>
+        <w:spacing w:after="120" w:before="60"/>
+      </w:pPr>
+      <w:r>
+        <w:t xml:space="preserve"/>
+      </w:r>
+    </w:p>
+    <w:p>
+      <w:pPr>
+        <w:pStyle w:val="Heading2"/>
+      </w:pPr>
+      <w:r>
+        <w:t>9.10 Key Differences from Pharma/Biotech Plugin</w:t>
+      </w:r>
+    </w:p>
+    <w:p>
+      <w:pPr>
+        <w:pStyle w:val="ListParagraph"/>
+        <w:numPr>
+          <w:ilvl w:val="0"/>
+          <w:numId w:val="1"/>
+        </w:numPr>
+        <w:spacing w:after="60" w:before="60"/>
+      </w:pPr>
+      <w:r>
+        <w:rPr>
+          <w:b/>
+          <w:bCs/>
+        </w:rPr>
+        <w:t xml:space="preserve">Scientific Balance: </w:t>
+      </w:r>
+      <w:r>
+        <w:t xml:space="preserve">Non-promotional mandate: promotional-review-checker enforces fair balance and flags marketing language</w:t>
+      </w:r>
+    </w:p>
+    <w:p>
+      <w:pPr>
+        <w:pStyle w:val="ListParagraph"/>
+        <w:numPr>
+          <w:ilvl w:val="0"/>
+          <w:numId w:val="1"/>
+        </w:numPr>
+        <w:spacing w:after="60" w:before="60"/>
+      </w:pPr>
+      <w:r>
+        <w:rPr>
+          <w:b/>
+          <w:bCs/>
+        </w:rPr>
+        <w:t xml:space="preserve">Evidence Grading: </w:t>
+      </w:r>
+      <w:r>
+        <w:t xml:space="preserve">Every claim must state its evidence level (1a through 5 + preprint)</w:t>
+      </w:r>
+    </w:p>
+    <w:p>
+      <w:pPr>
+        <w:pStyle w:val="ListParagraph"/>
+        <w:numPr>
+          <w:ilvl w:val="0"/>
+          <w:numId w:val="1"/>
+        </w:numPr>
+        <w:spacing w:after="60" w:before="60"/>
+      </w:pPr>
+      <w:r>
+        <w:rPr>
+          <w:b/>
+          <w:bCs/>
+        </w:rPr>
+        <w:t xml:space="preserve">Compliance Layer: </w:t>
+      </w:r>
+      <w:r>
+        <w:t xml:space="preserve">GPP3, ICMJE, CHEERS, PRISMA compliance checked at every phase</w:t>
+      </w:r>
+    </w:p>
+    <w:p>
+      <w:pPr>
+        <w:pStyle w:val="ListParagraph"/>
+        <w:numPr>
+          <w:ilvl w:val="0"/>
+          <w:numId w:val="1"/>
+        </w:numPr>
+        <w:spacing w:after="60" w:before="60"/>
+      </w:pPr>
+      <w:r>
+        <w:rPr>
+          <w:b/>
+          <w:bCs/>
+        </w:rPr>
+        <w:t xml:space="preserve">Payer Intelligence: </w:t>
+      </w:r>
+      <w:r>
+        <w:t xml:space="preserve">HTA body requirements (NICE, G-BA, HAS, ICER) with specific thresholds</w:t>
+      </w:r>
+    </w:p>
+    <w:p>
+      <w:pPr>
+        <w:pStyle w:val="ListParagraph"/>
+        <w:numPr>
+          <w:ilvl w:val="0"/>
+          <w:numId w:val="1"/>
+        </w:numPr>
+        <w:spacing w:after="60" w:before="60"/>
+      </w:pPr>
+      <w:r>
+        <w:rPr>
+          <w:b/>
+          <w:bCs/>
+        </w:rPr>
+        <w:t xml:space="preserve">Audience Shift: </w:t>
+      </w:r>
+      <w:r>
+        <w:t xml:space="preserve">Medical Affairs informs; it does not sell. All deliverables must be balanced.</w:t>
+      </w:r>
+    </w:p>
+    <w:p>
+      <w:pPr>
+        <w:pStyle w:val="Heading2"/>
+      </w:pPr>
+      <w:r>
+        <w:t>9.11 Installation</w:t>
+      </w:r>
+    </w:p>
+    <w:p>
+      <w:pPr>
+        <w:spacing w:after="120" w:before="60"/>
+      </w:pPr>
+      <w:r>
+        <w:t xml:space="preserve">To use the Medical Affairs plugin with Claude Code:</w:t>
+      </w:r>
+    </w:p>
+    <w:p>
+      <w:pPr>
+        <w:spacing w:after="120" w:before="120"/>
+      </w:pPr>
+      <w:r>
+        <w:rPr>
+          <w:rFonts w:ascii="Courier New" w:cs="Courier New" w:eastAsia="Courier New" w:hAnsi="Courier New"/>
+          <w:sz w:val="20"/>
+          <w:szCs w:val="20"/>
+        </w:rPr>
+        <w:t xml:space="preserve">claude --plugin-dir /path/to/CoworkPowers-MedAffairs</w:t>
+      </w:r>
+    </w:p>
+    <w:p>
+      <w:pPr>
+        <w:spacing w:after="120" w:before="60"/>
+      </w:pPr>
+      <w:r>
+        <w:t xml:space="preserve">Or navigate to the plugin directory and run Claude Code:</w:t>
+      </w:r>
+    </w:p>
+    <w:p>
+      <w:pPr>
+        <w:spacing w:after="120" w:before="120"/>
+      </w:pPr>
+      <w:r>
+        <w:rPr>
+          <w:rFonts w:ascii="Courier New" w:cs="Courier New" w:eastAsia="Courier New" w:hAnsi="Courier New"/>
+          <w:sz w:val="20"/>
+          <w:szCs w:val="20"/>
+        </w:rPr>
+        <w:t xml:space="preserve">cd /path/to/CoworkPowers-MedAffairs &amp;&amp; claude</w:t>
+      </w:r>
+    </w:p>
+    <w:p>
+      <w:pPr>
+        <w:spacing w:after="120" w:before="60"/>
+      </w:pPr>
+      <w:r>
+        <w:t xml:space="preserve">A zip archive (CoworkPowers-MedAffairs.zip) is also available for Cowork integration.</w:t>
       </w:r>
     </w:p>
     <w:sectPr>
@@ -8652,6 +12611,14 @@
     </w:lvlOverride>
   </w:num>
 </w:numbering>
+</file>
+
+<file path=word/people.xml><?xml version="1.0" encoding="utf-8"?>
+<w15:people xmlns:w15="http://schemas.microsoft.com/office/word/2012/wordml">
+  <w15:person w15:author="Claude">
+    <w15:presenceInfo w15:providerId="None" w15:userId="Claude"/>
+  </w15:person>
+</w15:people>
 </file>
 
 <file path=word/styles.xml><?xml version="1.0" encoding="utf-8"?>

</xml_diff>